<commit_message>
Remove unused activity remnants and refresh current expedition checks and GDD
</commit_message>
<xml_diff>
--- a/docs/Rocket_Rogue_Game_Design_Document.docx
+++ b/docs/Rocket_Rogue_Game_Design_Document.docx
@@ -2661,7 +2661,7 @@
             <w:r>
               <w:rPr>
                 <w:color w:val="000000"/>
-                <w:sz w:val="20"/>
+                <w:sz w:val="18"/>
               </w:rPr>
               <w:t>Breakthrough</w:t>
             </w:r>
@@ -3717,10 +3717,7 @@
               <w:spacing w:before="40" w:after="60" w:line="252" w:lineRule="auto"/>
             </w:pPr>
             <w:r>
-              <w:rPr>
-                <w:sz w:val="20"/>
-              </w:rPr>
-              <w:t>20 Common Ore delivery, scanner discovery, EVA anomaly recovery, and Mars lead. Battery binding: TBD S3.</w:t>
+              <w:t>20 Common Ore delivery, scanner discovery, EVA anomaly recovery, explicit Prospector MK I and Slot 1 reward, and Mars lead. Battery binding: TBD S3.</w:t>
             </w:r>
           </w:p>
         </w:tc>
@@ -4277,7 +4274,7 @@
         <w:pStyle w:val="ListNumber"/>
       </w:pPr>
       <w:r>
-        <w:t>Begin at Earth with the ship held beside the planet below-left and the Moon above-right. Acknowledge Mission Control, then select Launch to begin the expedition. Rotate, burn, reverse thrust, and coast to shape the trajectory into the orbital capture bands. Earth remains the service home for the return leg and later expeditions.</w:t>
+        <w:t>Begin at the Earth launch berth with the Moon above-right. The first view fades in for one second and loads the side panel. Selecting Launch opens Mission Control; acknowledging Ready to launch releases the ship. Rotate, burn, reverse and coast to shape the trajectory. Earth remains the service home for the return leg and later expeditions.</w:t>
       </w:r>
     </w:p>
     <w:p>
@@ -4338,10 +4335,7 @@
     <w:p>
       <w:pPr/>
       <w:r>
-        <w:t>C or controller left-stick click toggles cruise. Cruise uses ordinary steering and forward thrust toward the selected body center, with no braking, avoidance, capture assistance, fuel advantage, or destination protection. Manual steering or thrust cancels it immediately. Map inspection pauses simulation and visibly identifies cruise that will resume on closing. Earth docking requires rendezvous with its orbital marker at low relative speed and an explicit Dock action; choosing Earth on the map does not dock or service the ship. Plot course immediately exposes target guidance and a brief manual-flight or active-cruise notice. At home, Depart dock enters a ready view; the dock holds the ship until forward thrust releases it and applies ordinary thrust in the same step. No velocity grant or protection persists after undocking.</w:t>
-      </w:r>
-      <w:r>
-        <w:t xml:space="preserve"> The Earth service dock is 1.962 units toward the Moon from Earth center, outside every local gravity region including its full docking range. Dock offsets belong to system content. Explicitly attached Earth dock saves follow the current marker, preserving resources and heading; free-flight and surface positions remain unchanged.</w:t>
+        <w:t>C or controller left-stick click toggles cruise. Cruise uses ordinary steering and forward thrust toward the selected body center, with no braking, avoidance, capture assistance, fuel advantage, or destination protection. Manual steering or thrust cancels it immediately. Map inspection pauses simulation and visibly identifies cruise that will resume on closing. Earth docking requires rendezvous with its orbital marker within 0.32 system units at no more than 0.20 relative speed and an explicit Dock action; choosing Earth on the map does not dock or service the ship. Plot course immediately exposes target guidance and a brief manual-flight or active-cruise notice. At home, Depart dock enters a ready view; the dock holds the ship until forward thrust releases it and applies ordinary thrust in the same step. No velocity grant or protection persists after undocking. The Earth service dock is 1.962 units toward the Moon from Earth center, outside every local gravity region including its full docking range. Dock offsets belong to system content. Explicitly attached Earth dock saves follow the current marker, preserving resources and heading; free-flight and surface positions remain unchanged.</w:t>
       </w:r>
     </w:p>
     <w:p>
@@ -4354,7 +4348,7 @@
     </w:p>
     <w:p>
       <w:r>
-        <w:t>One physical Flight simulation owns Travel, Orbit, and Landing. The opening holds the ship at an authored Earth launch berth. Launch applies its departure impulse once; subsequent gravity, thrust, fuel use and collision follow ordinary flight. A saved Mission Control Incoming Message explains steering, thrust, the coast trajectory and orbit bands; Ready to launch acknowledges the message; the ship waits for the separate Launch action and fresh gameplay inputs. A/D rotate counterclockwise/clockwise; W thrusts along the nose and S reverses. Keyboard thrust ramps over 0.40 seconds and release cuts immediately; analog input is proportional. Coasting spends no propulsion fuel. Position, velocity, fuel, heat and hull stay authoritative; orbit capture remains manual.</w:t>
+        <w:t>One physical Flight simulation owns Travel, Orbit and Landing. The opening Launch action presents the saved Mission Control transmission before releasing the departure impulse. A/D rotate; W thrusts along the nose and S reverses. Keyboard thrust ramps over 0.40 seconds and release cuts immediately; analog input is proportional. Coasting spends no propulsion fuel. Powered heat accumulation is reduced for forgiving correction burns; the first Moon mission also receives four times the normal thermal failure grace. Position, velocity, fuel, heat and hull remain authoritative.</w:t>
       </w:r>
     </w:p>
     <w:tbl>
@@ -4553,7 +4547,7 @@
                 <w:color w:val="000000"/>
                 <w:sz w:val="20"/>
               </w:rPr>
-              <w:t>Laser heat and excavation limits</w:t>
+              <w:t>Laser reach and excavation limits</w:t>
             </w:r>
           </w:p>
         </w:tc>
@@ -4601,7 +4595,7 @@
                 <w:color w:val="000000"/>
                 <w:sz w:val="20"/>
               </w:rPr>
-              <w:t>Cut, cool, inspect, or land.</w:t>
+              <w:t>Cut, inspect, or land.</w:t>
             </w:r>
           </w:p>
         </w:tc>
@@ -4784,12 +4778,9 @@
     </w:p>
     <w:p>
       <w:r>
-        <w:t xml:space="preserve">After capture, Space/Enter, controller South, or the primary action begins a two-second Pulse Survey from any qualifying orbit. Flight motion and its fuel, hull and engine heat pause intact. Survey Array reveals the entry layer plus 1 to 4 deeper layers independently of Bore. Findings summarize actual </w:t>
+        <w:t>After capture, Space/Enter, controller South or SCAN starts a two-second survey in the selected sector. The ship radiates a scanner pulse. Flight motion, fuel, hull and engine heat pause intact. Survey Array reveals the entry layer plus one to four deeper layers independently of Bore. Findings describe actual prepared terrain without granting cargo. The first lunar anomaly remains hidden until its discovery lesson.</w:t>
       </w:r>
-      <w:r>
-        <w:lastRenderedPageBreak/>
-        <w:t>prepared geology, without exact hidden object coordinates or crediting ore; the first lunar anomaly remains concealed.</w:t>
-      </w:r>
+      <w:r/>
     </w:p>
     <w:p>
       <w:pPr>
@@ -4801,7 +4792,7 @@
     </w:p>
     <w:p>
       <w:r>
-        <w:t>Only Zone 1 is enabled among six fixed 60-degree sectors. After survey, enter that sector and press and hold again to fire. Holding across the boundary cannot start the beam. The aimed laser mount points at the site without turning the ship. The ten-cell shaft is limited by the lesser of Survey reach and Bore rating; solid material requires three beam-seconds per full layer and empty rows require no work. Support terrain, protected gates, artifact barriers, suit passages, fuel and oxygen pockets stop the beam. Excavated ore remains physical loose cargo in the cached layer.</w:t>
+        <w:t>All six fixed 60-degree sectors are enabled. Captured flight selects the nearest sector from the actual body-relative ship bearing and changes selection discretely at sector boundaries. The sector does not smoothly track the ship. Each system/body/sector identity owns independently generated terrain, scan progress, excavation, loose resources and objectives. Generation depends on campaign seed and stable site identity, never visit count. Revisits and reloads restore the same site without regenerating artifacts or rewards.</w:t>
       </w:r>
     </w:p>
     <w:p>
@@ -4814,7 +4805,7 @@
     </w:p>
     <w:p>
       <w:r>
-        <w:t>Laser heat rises 25 points per second and cools 35 per second. At 100 the beam stops; cooling to 25 and a fresh press permit restart. Laser work spends no ship fuel or hull. Resume Flight, Escape/controller East, or steering/thrust exits inspection. Findings, excavation and cooling persist for the visit. The cutaway, shaft, beam and landing sector share one transformed bearing; inactive sectors do not expose selectable sites.</w:t>
+        <w:t>After surveying, hold DRILL to excavate the selected site and release to stop. The laser has no heat or cooldown mechanic. Reach is limited by both Survey Array and Bore ratings. The red beam appears only during drilling; the completed shaft stays green for contrast. Protected support, gates, suit-only passages and supply objects remain protected. Resume Flight, Escape/controller East or steering/thrust exits inspection. Save the previous sector before switching and restore its own progress on return. Guidance reads ORBIT HERE before capture, SCAN HERE after capture, then DRILL HERE or LAND HERE at the surface; surface labels sit beside the approach lane.</w:t>
       </w:r>
     </w:p>
     <w:p>
@@ -4827,7 +4818,7 @@
     </w:p>
     <w:p>
       <w:r>
-        <w:t>Manual descent crosses the authorized inward gate at radius 0.40. Gate entry projects momentum into the local frame at a fixed 12:1 conversion, without a speed clamp, beginning at 60 m altitude. Alternatively, the Land action during completed-survey inspection inside Zone 1 stops linear and angular motion, holds position, and rotates the nose inward over one second. Gravity and manual control resume afterward. This explicit alignment action is not an automatic landing pilot.</w:t>
+        <w:t>Manual descent crosses the selected authorized inward gate at radius 0.40 and projects momentum into the local frame at a fixed 12:1 conversion, starting at 60 m. Alternatively, LAND during surveyed inspection stops linear and angular motion and rotates the nose inward over one second before gravity and controls resume. Both paths bind the selected site through descent, mining and ascent. The alignment action is not an automatic landing pilot.</w:t>
       </w:r>
     </w:p>
     <w:p>
@@ -4853,11 +4844,9 @@
     </w:p>
     <w:p>
       <w:r>
-        <w:t>The opening camera frames Earth below-left, ship beside Earth and Moon above-right with its capture bands, with bounded zoom so the ship stays readable. A selected destination has an on-body marker or offscreen arrow and distance. The colored trajectory predicts coasting through the same gravity, collisions and frame transitions as live motion; it does not steer toward the target. While departing home, bands preview the selected destination. Expedition-body encounters own local orbit bands, capture feedback and landing alignment even when another navigation target is selected. Orbit uses 40 percent world speed with full controls. The camera blends into body inspection and the existing 1.25-second local-descent handoff. Terrain, excavation and ship scale remain continuous through deployment and ascent; camera blending never chooses collision rules.</w:t>
+        <w:t>The opening camera frames Earth below-left and Moon above-right while keeping the ship readable. Body framing changes gradually by actual distance on approach and departure; coordinate-frame ownership never chooses an abrupt zoom or simulation clock. Near bodies, world time is slowed with full player controls and eases into travel timing. The compact top HUD blends in during terrain-backed descent over 0.6 seconds and reserves the XP row before deployment. A shared surface transform uses square terrain cells, uniform artwork scale and a touchdown contact near 28 percent of the usable viewport, with at least 24 pixels of ship clearance below the HUD. Airborne framing includes the full ship and approaching ground. Touchdown and bay opening retain the same scale and terrain anchors; smooth Rig following begins after control handoff. Nearby bedrock extends beyond the playable edges to fill the view.</w:t>
       </w:r>
-      <w:r>
-        <w:t xml:space="preserve"> The Earth home icon appears only when the entire Earth sprite is outside the actual flight viewport, with no duplicate home icon when Earth is selected. Dock markers render independently of planet visibility.</w:t>
-      </w:r>
+      <w:r/>
     </w:p>
     <w:p>
       <w:pPr>
@@ -4870,7 +4859,7 @@
     </w:p>
     <w:p>
       <w:r>
-        <w:t>A valid touchdown commits the landing immediately, starts a restrained camera jolt that settles within 0.36 seconds, and plays a two-second celebration. Deploy Surface Team is available throughout the celebration; reduced-motion settings remove the jolt. Space/Enter or controller South deploys the team; a fresh press during touchdown buffers the command. R or a 0.45-second controller East hold departs without deployment. The first accepted command owns the sequence. Three seconds of bay opening, rig release and arrest, equipped-drone launch, staging and camera/layout handoff precede Mining control. Mining and resource clocks stay frozen until that handoff. Ship illumination reveals nearby terrain without exposing protected objectives.</w:t>
+        <w:t>Touchdown immediately commits the supported landing and plays the existing celebration. Shake and controller-rumble duration scale with impact speed; the former full effect is reserved for severe landings. A damaging but survived landing queues a concerned Mission Control transmission explaining upward thrust and a softer touchdown. Deploy Surface Team is available during celebration. Space/Enter or controller South deploys; R or a held controller East departs without deployment. The first command owns the sequence. Three seconds of bay opening, Rig release and equipped-drone staging precede Mining control. Mining and resource clocks remain frozen until handoff.</w:t>
       </w:r>
     </w:p>
     <w:p>
@@ -4883,7 +4872,7 @@
     </w:p>
     <w:p>
       <w:r>
-        <w:t>At the parked ship, packing settles carried payload once and retains excavated layers. Ignition hands control to local Landing at the actual ship position. A support latch allows thrust to lift off without immediately retriggering touchdown; subsequent contacts use normal landing damage. Departure thrust consumes no fuel until the ship reaches +60 m relative to the fixed surface origin with upward speed at least 2 m/s. Gravity, heat, rotation and collision remain active. The camera blends back to Orbit, momentum converts back, and another descent requires the gate to rearm outside radius 0.55.</w:t>
+        <w:t>Packing at the parked ship settles carried payload once and preserves excavation. Ignition begins upright local ascent with thrust already engaged. Departure assistance regulates climb toward 8 m/s until the player takes throttle control or local ascent ends. Crossing 46 m above the surface origin at at least 2 m/s upward exits to orbit. The support latch permits liftoff without immediately relanding; subsequent contacts retain normal collision damage. Local ascent has no heat damage. The orbital handoff ends automatic thrust, preserves converted momentum and eases camera and world timing toward travel.</w:t>
       </w:r>
     </w:p>
     <w:p>
@@ -5303,7 +5292,7 @@
                 <w:color w:val="000000"/>
                 <w:sz w:val="20"/>
               </w:rPr>
-              <w:t>Hold a fresh primary press inside Zone 1.</w:t>
+              <w:t>Hold a fresh primary press inside the selected sector.</w:t>
             </w:r>
           </w:p>
         </w:tc>
@@ -5327,7 +5316,7 @@
                 <w:color w:val="000000"/>
                 <w:sz w:val="20"/>
               </w:rPr>
-              <w:t>Flight remains paused; beam modifies cached terrain and heats independently.</w:t>
+              <w:t>Flight remains paused; beam modifies cached terrain within the Survey and Bore ranks; no laser heat.</w:t>
             </w:r>
           </w:p>
         </w:tc>
@@ -5380,7 +5369,7 @@
                 <w:color w:val="000000"/>
                 <w:sz w:val="20"/>
               </w:rPr>
-              <w:t>Cross authorized gate or select Land during surveyed inspection in Zone 1.</w:t>
+              <w:t>Cross authorized gate or select Land during surveyed inspection in the selected sector.</w:t>
             </w:r>
           </w:p>
         </w:tc>
@@ -5635,7 +5624,7 @@
                 <w:color w:val="000000"/>
                 <w:sz w:val="20"/>
               </w:rPr>
-              <w:t>Settle the visit once; pilot ascent to +60 m and at least 2 m/s upward. Continue live travel or return to dock; XP and cargo persist until home or loss.</w:t>
+              <w:t>Settle the visit once; pilot ascent to +46 m and at least 2 m/s upward. Continue live travel or return to dock; XP and cargo persist until home or loss.</w:t>
             </w:r>
           </w:p>
         </w:tc>
@@ -5646,8 +5635,13 @@
         <w:pStyle w:val="Heading2"/>
       </w:pPr>
       <w:r>
-        <w:lastRenderedPageBreak/>
         <w:t>Mining and Physical Recovery</w:t>
+      </w:r>
+    </w:p>
+    <w:p>
+      <w:pPr/>
+      <w:r>
+        <w:t>The Rig uses a shared circular body and solid triangular drill fitted to opaque artwork. The scanner ring, exhaust and particles are not colliders. Circle/cell and triangle/cell contact plus swept translation and turning prevent corner clipping. Simulation accepts the heading and rendering displays it directly. Inactive drills block on terrain; active drills damage contacted cells under the existing resource rules. Escape movement may reduce overlap but cannot introduce new contacts or cross a wall. Placement, towing and depth clearance share the compound shape; EVA retains its own collider and exclusive passages. A developer overlay shows shapes, blocking cells and contact normals.</w:t>
       </w:r>
     </w:p>
     <w:p>
@@ -6032,15 +6026,8 @@
             <w:shd w:val="clear" w:color="auto" w:fill="F5F7F9"/>
           </w:tcPr>
           <w:p>
-            <w:pPr>
-              <w:spacing w:before="40" w:after="60" w:line="252" w:lineRule="auto"/>
-            </w:pPr>
-            <w:r>
-              <w:rPr>
-                <w:color w:val="000000"/>
-                <w:sz w:val="20"/>
-              </w:rPr>
-              <w:t>Laser heat</w:t>
+            <w:r>
+              <w:t>Laser reach</w:t>
             </w:r>
           </w:p>
         </w:tc>
@@ -6056,15 +6043,8 @@
             <w:shd w:val="clear" w:color="auto" w:fill="F5F7F9"/>
           </w:tcPr>
           <w:p>
-            <w:pPr>
-              <w:spacing w:before="40" w:after="60" w:line="252" w:lineRule="auto"/>
-            </w:pPr>
-            <w:r>
-              <w:rPr>
-                <w:color w:val="000000"/>
-                <w:sz w:val="20"/>
-              </w:rPr>
-              <w:t>Limits orbital beam duty cycle.</w:t>
+            <w:r>
+              <w:t>Sets maximum orbital excavation depth.</w:t>
             </w:r>
           </w:p>
         </w:tc>
@@ -6080,15 +6060,8 @@
             <w:shd w:val="clear" w:color="auto" w:fill="F5F7F9"/>
           </w:tcPr>
           <w:p>
-            <w:pPr>
-              <w:spacing w:before="40" w:after="60" w:line="252" w:lineRule="auto"/>
-            </w:pPr>
-            <w:r>
-              <w:rPr>
-                <w:color w:val="000000"/>
-                <w:sz w:val="20"/>
-              </w:rPr>
-              <w:t>Heat +25/s, cooling 35/s; stop at 100, restart at 25 with fresh input.</w:t>
+            <w:r>
+              <w:t>Limited by Survey and Bore ranks. No heat or cooldown.</w:t>
             </w:r>
           </w:p>
         </w:tc>
@@ -6311,15 +6284,8 @@
             <w:shd w:val="clear" w:color="auto" w:fill="FFFFFF"/>
           </w:tcPr>
           <w:p>
-            <w:pPr>
-              <w:spacing w:before="40" w:after="60" w:line="252" w:lineRule="auto"/>
-            </w:pPr>
-            <w:r>
-              <w:rPr>
-                <w:color w:val="000000"/>
-                <w:sz w:val="20"/>
-              </w:rPr>
-              <w:t>24-mass Rig limit; shared expedition hold capacity across visits. Ship delivery credits contracts; home docking banks ordinary salvage.</w:t>
+            <w:r>
+              <w:t>24-mass Rig limit; initial ship hold is 60 across visits. Excess stays behind. Ship delivery credits contracts; home docking banks ordinary salvage.</w:t>
             </w:r>
           </w:p>
         </w:tc>
@@ -6931,7 +6897,6 @@
                 <w:color w:val="000000"/>
                 <w:sz w:val="20"/>
               </w:rPr>
-              <w:lastRenderedPageBreak/>
               <w:t>Bore System</w:t>
             </w:r>
           </w:p>
@@ -7800,7 +7765,7 @@
     </w:p>
     <w:p>
       <w:r>
-        <w:t>Physical delivery to the parked ship allocates contract ore first; ordinary salvage enters the expedition hold and remains at risk until operational-home docking. The hold capacity follows the existing ship-hold rank across visits. Earth banks carried materials and arrival payouts, services fuel and hull, and ends temporary expedition progression in one summary. The existing arrival payout is carried on the first accepted landing at an authored site; revisits do not duplicate it. Drone contract allocations, rewards, and XP amounts remain unchanged. Existing artifact recovery and explicit campaign claims remain separate; unique battery mission binding is TBD S3.</w:t>
+        <w:t>Physical delivery allocates contract ore first; ordinary salvage enters the expedition hold and remains at risk until home docking. The initial hold carries 60 ore. Excess is rejected and remains with its physical carrier or in the site, including departure with overloaded Rig or Prospector cargo; it is never silently banked. First-full Rig and repeated ship hoarding receive contextual transmissions. Loose ore within the Rig collection field is pulled into the Rig, with an upgrade path for radius. Laser debris disappears on reaching the shaft bottom instead of pooling there. Earth banks carried cargo and payout, services fuel and hull, and ends temporary progression once. Revisits do not duplicate payouts.</w:t>
       </w:r>
     </w:p>
     <w:tbl>
@@ -8260,7 +8225,6 @@
                 <w:color w:val="000000"/>
                 <w:sz w:val="20"/>
               </w:rPr>
-              <w:lastRenderedPageBreak/>
               <w:t>Flight Data</w:t>
             </w:r>
           </w:p>
@@ -8470,12 +8434,15 @@
     </w:tbl>
     <w:p>
       <w:r>
-        <w:t>Progression artifacts use one deterministic placement curve. The ordinal counts unique authored artifact-bearing destinations already represented in permanent inventory; incidental artifacts, duplicate destination artifacts, temporary payloads, and failed recoveries do not advance it. Three progression artifacts share each depth: slot 0 is centered exactly ten cells below entry, slots 1 and 2 use seeded 11-14 and 15-20 cell Manhattan displacement with 1-10 cells down and no more than 10 left or right, and the next trio resets to the centered layout one depth deeper. Cached target layers preserve the result across recall, failure, reload, and redeployment.</w:t>
+        <w:t>Progression artifacts use deterministic placement and cached target layers. The lunar anomaly belongs to the first scanned Moon sector once per campaign; existing saved placement and completion are preserved. Its EVA tunnel is offset six cells from the previous anchor so it lies beside the laser shaft. Other sectors provide ordinary mining content. Later authored artifact placements retain their progression curve. Collected artifacts and completed objectives never regenerate on revisits, reloads or recovery.</w:t>
       </w:r>
     </w:p>
     <w:p>
       <w:r>
         <w:t>Survey Triangulation keeps the artifact tile, sprite, purple glow, label, guidance, and tether target completely hidden until three invisible signal points are covered by actual scanner pulses. One large aura around the concealed site is divided into three equal 120-degree slices: incomplete slices are bright cyan/teal and completed slices turn green. A player or Survey Drone pulse may complete multiple slices. At 3/3 the gate opens in the same reconciliation, the aura disappears, and the exposed artifact returns with its prominent purple glow. Non-triangulation sites such as Io retain the purple undiscovered-tile and cocoon presentation.</w:t>
+      </w:r>
+      <w:r>
+        <w:t xml:space="preserve"> Artifact signage is visible only while the artifact is not tethered; releasing its tether restores the sign.</w:t>
       </w:r>
     </w:p>
     <w:p>
@@ -8670,15 +8637,8 @@
             <w:vAlign w:val="center"/>
           </w:tcPr>
           <w:p>
-            <w:pPr>
-              <w:spacing w:before="40" w:after="60" w:line="252" w:lineRule="auto"/>
-            </w:pPr>
-            <w:r>
-              <w:rPr>
-                <w:color w:val="000000"/>
-                <w:sz w:val="20"/>
-              </w:rPr>
-              <w:t>Prospector Mk I contract</w:t>
+            <w:r>
+              <w:t>First artifact reward</w:t>
             </w:r>
           </w:p>
         </w:tc>
@@ -8941,7 +8901,6 @@
                 <w:color w:val="000000"/>
                 <w:sz w:val="20"/>
               </w:rPr>
-              <w:lastRenderedPageBreak/>
               <w:t>Hazard Drone</w:t>
             </w:r>
           </w:p>
@@ -9236,7 +9195,7 @@
     </w:p>
     <w:p>
       <w:r>
-        <w:t>Losing or explicitly abandoning an expedition creates a persistent wreck containing carried salvage and unbanked payout. The replacement is viable at the operational home even with zero funds or fuel, retains installed permanent capability, and resets temporary XP and build. Fatal-body impacts place the wreck signal outside the collision boundary along the incoming path. Recovery requires physical rendezvous and an explicit transfer; excess ore remains at the wreck when the hold fills. Additional losses create separate wrecks. Crew consequences and replacement-economy tuning remain TBD S5.</w:t>
+        <w:t>The first Moon mission uses a simple Retry launch recovery instead of introducing course plotting, dock and shipyard after failure. Mission Control uses the concerned portrait: the first crash reassures, the second gives tips, the third makes the crater-record remark, and fourth and later crashes return to tips. Overheating receives cause-specific guidance. Later expedition loss creates a persistent wreck with carried salvage and unbanked payout. A viable replacement appears at home; installed capability persists while temporary progression resets. Recover wreck cargo by approaching its signal and using Salvage. Excess remains at the wreck.</w:t>
       </w:r>
     </w:p>
     <w:p>
@@ -9367,7 +9326,7 @@
               <w:rPr>
                 <w:b/>
                 <w:color w:val="000000"/>
-                <w:sz w:val="20"/>
+                <w:sz w:val="16"/>
               </w:rPr>
               <w:t>Tier</w:t>
             </w:r>
@@ -11405,7 +11364,7 @@
         <w:pStyle w:val="ListBullet"/>
       </w:pPr>
       <w:r>
-        <w:t>Every action card must show cost, payoff, risk, and availability on the card.</w:t>
+        <w:t>Prioritize large primary action buttons and concise status. Remove repeated objectives, controls and explanations from captured-orbit inspection; SCAN, DRILL, LAND and RESUME FLIGHT remain prominent. Show additional help when context makes it useful.</w:t>
       </w:r>
     </w:p>
     <w:p>
@@ -12145,7 +12104,7 @@
     </w:p>
     <w:p>
       <w:r>
-        <w:t>ScenarioDefinition supplies authored eligibility, dependent steps, completion rules, explicit claims, and rewards. ScenarioEvent records physical deliveries, protected-objective recovery, arrivals, equipment assignment, and other activity results. In initialized solar expeditions, scenario acknowledgements and rewards do not queue a replacement flight, relocate the ship, or open retired route activities. Moon and Mars completion supply recommended navigation leads; their original contract and Drone rewards remain. Broader out-of-order mission acknowledgements and battery/Ark integration are TBD S3/S4.</w:t>
+        <w:t>Scenario definitions provide eligibility, dependent steps, completion rules, explicit claims and rewards. Typed events record physical deliveries, protected-objective recovery and other results. The Moon 20-ore delivery activates the anomaly but does not grant a Prospector. Confirming the first artifact recovery grants and equips Prospector MK I, Slot 1 and the Mars lead, then queues Meet your Prospector. Its base Common Ore mining cycle is five seconds; ranks improve the rate. Already earned drones remain owned across save migration and rewards cannot duplicate. Initialized solar expeditions never open the retired route activities or relocate the ship when a scenario advances. Battery and Ark integration remain TBD S3/S4.</w:t>
       </w:r>
       <w:r/>
     </w:p>
@@ -12159,7 +12118,7 @@
     </w:p>
     <w:p>
       <w:r>
-        <w:t>The campaign accepts exact version-21 saves. Incompatible and malformed payloads are preserved until explicit New Campaign confirmation; preferences remain separate. Flight pose, frame, resources, parked ship, departure state, cached terrain, physical objects, actor tanks, drone transit, expedition build, cargo, wrecks, course, cruise, and decision occurrences persist. Missing live-travel fields initialize once from a recorded physical flight/landing or confirmed Earth home; ambiguous legacy route records receive a position-unavailable notice and are not assigned a guessed location. Missing message state defaults safely. Prepared orbital work remains session-only until deployment or undeployed departure; touchdown commits in memory and completed handoffs establish saves. Unique battery/wreck ownership is validated. Physical battery missions and post-solar travel integration remain TBD S3/S4. Optional v21 opening/departure records preserve the first-flight acknowledgement and an armed dock departure. The held Earth berth, Launch release and departure history persist. Only a demonstrably unstarted Earth campaign receives opening initialization; mission history, visited sites, wrecks or uncertain progress prevent relocation.</w:t>
+        <w:t>The campaign accepts version-21 saves. Incompatible or malformed payloads are preserved until explicit New Campaign confirmation. Physical pose, coordinate frame, resources, parked ship, cached terrain, actors, cargo, wrecks and campaign progress persist. Optional site records retain each system/body/sector scan, excavation, layers and objective state, including sites never landed on. Older records use their stored sector or the original sector fallback. Restore site state without rolling back inventory, upgrades or campaign progress. Preserve existing tutorial anomaly placement and completion; assign the first scanned wedge only when no prior assignment or generated tutorial site exists. Missing optional fields default safely. Legacy compatibility records do not authorize regenerating or moving actors.</w:t>
       </w:r>
     </w:p>
     <w:p>
@@ -12310,11 +12269,7 @@
               <w:spacing w:before="40" w:after="60" w:line="252" w:lineRule="auto"/>
             </w:pPr>
             <w:r>
-              <w:rPr>
-                <w:color w:val="000000"/>
-                <w:sz w:val="20"/>
-              </w:rPr>
-              <w:t>Capture without repositioning; survey pause; laser fresh-press, zone, heat and protected-terrain limits; manual and explicit Land paths.</w:t>
+              <w:t>Capture without repositioning; survey pause; laser fresh-press, sector selection, rank reach and protected-terrain limits; manual and explicit Land paths.</w:t>
             </w:r>
           </w:p>
         </w:tc>
@@ -13141,7 +13096,7 @@
         <w:pStyle w:val="ListBullet"/>
       </w:pPr>
       <w:r>
-        <w:t>TBD S1 Teaching and pacing. The campaign opens with explicit Launch from Earth and one Mission Control Incoming Message explaining controls, trajectory and orbit capture. The 20-ore lunar contract separately introduces the surface scanner and EVA recovery. Further teaching and pacing for orbital Pulse Survey, laser drilling, descent and deployment remain unresolved; preserve the distinction between flight guidance and the surface-scanner lesson.</w:t>
+        <w:t>TBD S1 Further teaching and pacing. The implemented opening uses a one-second fade, Launch-triggered instruction, cause-aware crash retries and contextual messages for dock approach, hard landings, full cargo, lunar discovery and the first Prospector. Before the first Moon mission completes, dock instruction explains the dock and redirects the player to the Moon; afterward it omits the redirect. Preserve the distinction between orbital survey and the surface-scanner anomaly lesson. Further playtesting should refine timing and clarity without adding redundant text.</w:t>
       </w:r>
     </w:p>
     <w:p>

</xml_diff>

<commit_message>
Retire timing activities and migrate remaining campaign paths to physical play
</commit_message>
<xml_diff>
--- a/docs/Rocket_Rogue_Game_Design_Document.docx
+++ b/docs/Rocket_Rogue_Game_Design_Document.docx
@@ -4765,7 +4765,7 @@
     </w:p>
     <w:p>
       <w:r>
-        <w:t>Orbit capture requires a qualifying safe coasting loop and two real seconds without thrust; rotation is allowed. The assessment forecasts up to 60 simulated seconds. Precision rings determine a Perfect grade rather than excluding all wider Good orbits. Capture does not reposition the ship. Survey and orbital drilling operate within Flight; landing leads directly into the physical expedition. Story rewards remain explicit scenario actions. Navigation leads never grant movement permission; unresolved story connections are marked TBD in Section 8.</w:t>
+        <w:t>Orbit capture requires a qualifying safe coasting loop and two real seconds without thrust; rotation is allowed. The assessment forecasts up to 60 simulated seconds. Precision rings determine a Perfect grade rather than excluding all wider Good orbits. Capture does not reposition the ship. Survey and orbital drilling operate within Flight; landing leads directly into the physical expedition. Story rewards remain explicit scenario actions. Navigation leads never grant movement permission; unresolved story connections are marked TBD in Section 8. The separate Flyby, Orbit, pulse-timing Scan and Push Deeper activities are retired in every campaign and scenario. Surface preparation has no timing-grade gate; orbital work and Rig/EVA mining supply the real-time actions. The outer-system departure course is explicitly confirmed after its artifact prerequisite, without a Perfect slingshot challenge.</w:t>
       </w:r>
     </w:p>
     <w:p>
@@ -12118,7 +12118,7 @@
     </w:p>
     <w:p>
       <w:r>
-        <w:t>The campaign accepts version-21 saves. Incompatible or malformed payloads are preserved until explicit New Campaign confirmation. Physical pose, coordinate frame, resources, parked ship, cached terrain, actors, cargo, wrecks and campaign progress persist. Optional site records retain each system/body/sector scan, excavation, layers and objective state, including sites never landed on. Older records use their stored sector or the original sector fallback. Restore site state without rolling back inventory, upgrades or campaign progress. Preserve existing tutorial anomaly placement and completion; assign the first scanned wedge only when no prior assignment or generated tutorial site exists. Missing optional fields default safely. Legacy compatibility records do not authorize regenerating or moving actors.</w:t>
+        <w:t>The campaign accepts version-21 saves. Incompatible or malformed payloads are preserved until explicit New Campaign confirmation. Physical pose, coordinate frame, resources, parked ship, cached terrain, actors, cargo, wrecks and campaign progress persist. Optional site records retain each system/body/sector scan, excavation, layers and objective state, including sites never landed on. Older records use their stored sector or the original sector fallback. Restore site state without rolling back inventory, upgrades or campaign progress. Preserve existing tutorial anomaly placement and completion; assign the first scanned wedge only when no prior assignment or generated tutorial site exists. Missing optional fields default safely. Legacy compatibility records do not authorize regenerating or moving actors. Retired v21 activity screens resume physical flight at a safe approach only when no physical pose exists. Recorded physical position and momentum are retained. Historical transfer-assist records grant no fuel discount, speed boost or instability penalty. Saved scenario identifiers remain stable so completed objectives and rewards stay completed.</w:t>
       </w:r>
     </w:p>
     <w:p>

</xml_diff>

<commit_message>
Polish expedition progression and arrival flow
</commit_message>
<xml_diff>
--- a/docs/Rocket_Rogue_Game_Design_Document.docx
+++ b/docs/Rocket_Rogue_Game_Design_Document.docx
@@ -2402,15 +2402,8 @@
             <w:shd w:val="clear" w:color="auto" w:fill="FFFFFF"/>
           </w:tcPr>
           <w:p>
-            <w:pPr>
-              <w:spacing w:before="40" w:after="60" w:line="252" w:lineRule="auto"/>
-            </w:pPr>
-            <w:r>
-              <w:rPr>
-                <w:color w:val="000000"/>
-                <w:sz w:val="20"/>
-              </w:rPr>
-              <w:t>TBD S1/S2: teaching sequence and equipment gates.</w:t>
+            <w:r>
+              <w:t>Implemented opening; teaching and economy tuning remain open.</w:t>
             </w:r>
           </w:p>
         </w:tc>
@@ -2503,14 +2496,8 @@
             <w:shd w:val="clear" w:color="auto" w:fill="F5F7F9"/>
           </w:tcPr>
           <w:p>
-            <w:pPr>
-              <w:spacing w:before="40" w:after="60" w:line="252" w:lineRule="auto"/>
-            </w:pPr>
-            <w:r>
-              <w:rPr>
-                <w:sz w:val="20"/>
-              </w:rPr>
-              <w:t>Moon contract, EVA anomaly, and Mars lead. Battery binding: TBD S3.</w:t>
+            <w:r>
+              <w:t>Moon contract, artifact, battery, Prospector, and Mars discovery are canonical.</w:t>
             </w:r>
           </w:p>
         </w:tc>
@@ -2603,14 +2590,8 @@
             <w:shd w:val="clear" w:color="auto" w:fill="FFFFFF"/>
           </w:tcPr>
           <w:p>
-            <w:pPr>
-              <w:spacing w:before="40" w:after="60" w:line="252" w:lineRule="auto"/>
-            </w:pPr>
-            <w:r>
-              <w:rPr>
-                <w:sz w:val="20"/>
-              </w:rPr>
-              <w:t>8 local Common Ore and explicit Slot 2 reward; onward lead to Io. Battery binding: TBD S3.</w:t>
+            <w:r>
+              <w:t>Mars ore and artifact claim grant Slot 2 and reveal Io.</w:t>
             </w:r>
           </w:p>
         </w:tc>
@@ -2679,14 +2660,8 @@
             <w:shd w:val="clear" w:color="auto" w:fill="F5F7F9"/>
           </w:tcPr>
           <w:p>
-            <w:pPr>
-              <w:spacing w:before="40" w:after="60" w:line="252" w:lineRule="auto"/>
-            </w:pPr>
-            <w:r>
-              <w:rPr>
-                <w:sz w:val="20"/>
-              </w:rPr>
-              <w:t>Io recovery and exploration of Saturn, Uranus, Neptune, and Straylight; visit order is flexible.</w:t>
+            <w:r>
+              <w:t>Main artifact route through Io, Titan, Titania, and Triton; Triton reveals Straylight.</w:t>
             </w:r>
           </w:p>
         </w:tc>
@@ -2702,14 +2677,8 @@
             <w:shd w:val="clear" w:color="auto" w:fill="F5F7F9"/>
           </w:tcPr>
           <w:p>
-            <w:pPr>
-              <w:spacing w:before="40" w:after="60" w:line="252" w:lineRule="auto"/>
-            </w:pPr>
-            <w:r>
-              <w:rPr>
-                <w:sz w:val="20"/>
-              </w:rPr>
-              <w:t>TBD S3: physical six-battery campaign integration and out-of-order acknowledgements.</w:t>
+            <w:r>
+              <w:t>Canonical six-battery progression with optional Earth returns and manual waypoints.</w:t>
             </w:r>
           </w:p>
         </w:tc>
@@ -3564,14 +3533,7 @@
             <w:shd w:val="clear" w:color="auto" w:fill="FFFFFF"/>
           </w:tcPr>
           <w:p>
-            <w:pPr>
-              <w:spacing w:before="40" w:after="60" w:line="252" w:lineRule="auto"/>
-            </w:pPr>
-            <w:r>
-              <w:rPr>
-                <w:color w:val="000000"/>
-                <w:sz w:val="20"/>
-              </w:rPr>
+            <w:r>
               <w:t>Earth program</w:t>
             </w:r>
           </w:p>
@@ -3588,14 +3550,7 @@
             <w:shd w:val="clear" w:color="auto" w:fill="FFFFFF"/>
           </w:tcPr>
           <w:p>
-            <w:pPr>
-              <w:spacing w:before="40" w:after="60" w:line="252" w:lineRule="auto"/>
-            </w:pPr>
-            <w:r>
-              <w:rPr>
-                <w:color w:val="000000"/>
-                <w:sz w:val="20"/>
-              </w:rPr>
+            <w:r>
               <w:t>First expedition</w:t>
             </w:r>
           </w:p>
@@ -3612,15 +3567,8 @@
             <w:shd w:val="clear" w:color="auto" w:fill="FFFFFF"/>
           </w:tcPr>
           <w:p>
-            <w:pPr>
-              <w:spacing w:before="40" w:after="60" w:line="252" w:lineRule="auto"/>
-            </w:pPr>
-            <w:r>
-              <w:rPr>
-                <w:color w:val="000000"/>
-                <w:sz w:val="20"/>
-              </w:rPr>
-              <w:t>Earth launch berth, explicit Launch and flight instruction; Earth orbital dock and Rank I shipyard on return. Further teaching: TBD S1.</w:t>
+            <w:r>
+              <w:t>Earth launch, manual flight, Earth dock, service, shipyard, recommended mission, and independent waypoint.</w:t>
             </w:r>
           </w:p>
         </w:tc>
@@ -3636,15 +3584,8 @@
             <w:shd w:val="clear" w:color="auto" w:fill="FFFFFF"/>
           </w:tcPr>
           <w:p>
-            <w:pPr>
-              <w:spacing w:before="40" w:after="60" w:line="252" w:lineRule="auto"/>
-            </w:pPr>
-            <w:r>
-              <w:rPr>
-                <w:color w:val="000000"/>
-                <w:sz w:val="20"/>
-              </w:rPr>
-              <w:t>Physical flight to Moon.</w:t>
+            <w:r>
+              <w:t>Fly to Moon.</w:t>
             </w:r>
           </w:p>
         </w:tc>
@@ -3665,14 +3606,7 @@
             <w:shd w:val="clear" w:color="auto" w:fill="F5F7F9"/>
           </w:tcPr>
           <w:p>
-            <w:pPr>
-              <w:spacing w:before="40" w:after="60" w:line="252" w:lineRule="auto"/>
-            </w:pPr>
-            <w:r>
-              <w:rPr>
-                <w:color w:val="000000"/>
-                <w:sz w:val="20"/>
-              </w:rPr>
+            <w:r>
               <w:t>Moon</w:t>
             </w:r>
           </w:p>
@@ -3689,15 +3623,8 @@
             <w:shd w:val="clear" w:color="auto" w:fill="F5F7F9"/>
           </w:tcPr>
           <w:p>
-            <w:pPr>
-              <w:spacing w:before="40" w:after="60" w:line="252" w:lineRule="auto"/>
-            </w:pPr>
-            <w:r>
-              <w:rPr>
-                <w:color w:val="000000"/>
-                <w:sz w:val="20"/>
-              </w:rPr>
-              <w:t>Lunar Prospector and anomaly</w:t>
+            <w:r>
+              <w:t>Lunar Prospector</w:t>
             </w:r>
           </w:p>
         </w:tc>
@@ -3713,11 +3640,8 @@
             <w:shd w:val="clear" w:color="auto" w:fill="F5F7F9"/>
           </w:tcPr>
           <w:p>
-            <w:pPr>
-              <w:spacing w:before="40" w:after="60" w:line="252" w:lineRule="auto"/>
-            </w:pPr>
-            <w:r>
-              <w:t>20 Common Ore delivery, scanner discovery, EVA anomaly recovery, explicit Prospector MK I and Slot 1 reward, and Mars lead. Battery binding: TBD S3.</w:t>
+            <w:r>
+              <w:t>Deliver 20 Common Ore; pulse and recover the Moon artifact; claim Prospector, Slot 1, Moon battery, Mars, Mercury, and Venus.</w:t>
             </w:r>
           </w:p>
         </w:tc>
@@ -3733,15 +3657,8 @@
             <w:shd w:val="clear" w:color="auto" w:fill="F5F7F9"/>
           </w:tcPr>
           <w:p>
-            <w:pPr>
-              <w:spacing w:before="40" w:after="60" w:line="252" w:lineRule="auto"/>
-            </w:pPr>
-            <w:r>
-              <w:rPr>
-                <w:color w:val="000000"/>
-                <w:sz w:val="20"/>
-              </w:rPr>
-              <w:t>Moon to Mars.</w:t>
+            <w:r>
+              <w:t>Earth service recommended; Mars next.</w:t>
             </w:r>
           </w:p>
         </w:tc>
@@ -3762,14 +3679,7 @@
             <w:shd w:val="clear" w:color="auto" w:fill="FFFFFF"/>
           </w:tcPr>
           <w:p>
-            <w:pPr>
-              <w:spacing w:before="40" w:after="60" w:line="252" w:lineRule="auto"/>
-            </w:pPr>
-            <w:r>
-              <w:rPr>
-                <w:color w:val="000000"/>
-                <w:sz w:val="20"/>
-              </w:rPr>
+            <w:r>
               <w:t>Mars</w:t>
             </w:r>
           </w:p>
@@ -3786,14 +3696,7 @@
             <w:shd w:val="clear" w:color="auto" w:fill="FFFFFF"/>
           </w:tcPr>
           <w:p>
-            <w:pPr>
-              <w:spacing w:before="40" w:after="60" w:line="252" w:lineRule="auto"/>
-            </w:pPr>
-            <w:r>
-              <w:rPr>
-                <w:color w:val="000000"/>
-                <w:sz w:val="20"/>
-              </w:rPr>
+            <w:r>
               <w:t>Bay Expansion</w:t>
             </w:r>
           </w:p>
@@ -3810,14 +3713,8 @@
             <w:shd w:val="clear" w:color="auto" w:fill="FFFFFF"/>
           </w:tcPr>
           <w:p>
-            <w:pPr>
-              <w:spacing w:before="40" w:after="60" w:line="252" w:lineRule="auto"/>
-            </w:pPr>
-            <w:r>
-              <w:rPr>
-                <w:sz w:val="20"/>
-              </w:rPr>
-              <w:t>8 Common Ore and explicit Slot 2 reward; Io lead. Battery binding: TBD S3.</w:t>
+            <w:r>
+              <w:t>Deliver 8 Common Ore; recover and claim the Mars artifact and battery; gain Slot 2 and reveal Jupiter and Io.</w:t>
             </w:r>
           </w:p>
         </w:tc>
@@ -3833,15 +3730,8 @@
             <w:shd w:val="clear" w:color="auto" w:fill="FFFFFF"/>
           </w:tcPr>
           <w:p>
-            <w:pPr>
-              <w:spacing w:before="40" w:after="60" w:line="252" w:lineRule="auto"/>
-            </w:pPr>
-            <w:r>
-              <w:rPr>
-                <w:color w:val="000000"/>
-                <w:sz w:val="20"/>
-              </w:rPr>
-              <w:t>Mars to Jupiter/Io.</w:t>
+            <w:r>
+              <w:t>Earth service recommended; Io next.</w:t>
             </w:r>
           </w:p>
         </w:tc>
@@ -3862,15 +3752,8 @@
             <w:shd w:val="clear" w:color="auto" w:fill="F5F7F9"/>
           </w:tcPr>
           <w:p>
-            <w:pPr>
-              <w:spacing w:before="40" w:after="60" w:line="252" w:lineRule="auto"/>
-            </w:pPr>
-            <w:r>
-              <w:rPr>
-                <w:color w:val="000000"/>
-                <w:sz w:val="20"/>
-              </w:rPr>
-              <w:t>Jupiter and Io</w:t>
+            <w:r>
+              <w:t>Io</w:t>
             </w:r>
           </w:p>
         </w:tc>
@@ -3886,14 +3769,7 @@
             <w:shd w:val="clear" w:color="auto" w:fill="F5F7F9"/>
           </w:tcPr>
           <w:p>
-            <w:pPr>
-              <w:spacing w:before="40" w:after="60" w:line="252" w:lineRule="auto"/>
-            </w:pPr>
-            <w:r>
-              <w:rPr>
-                <w:color w:val="000000"/>
-                <w:sz w:val="20"/>
-              </w:rPr>
+            <w:r>
               <w:t>Volcanic Descent</w:t>
             </w:r>
           </w:p>
@@ -3910,14 +3786,8 @@
             <w:shd w:val="clear" w:color="auto" w:fill="F5F7F9"/>
           </w:tcPr>
           <w:p>
-            <w:pPr>
-              <w:spacing w:before="40" w:after="60" w:line="252" w:lineRule="auto"/>
-            </w:pPr>
-            <w:r>
-              <w:rPr>
-                <w:sz w:val="20"/>
-              </w:rPr>
-              <w:t>Hazard Drone and protected artifact recovery; Io beacon battery. TBD S3: battery objective integration.</w:t>
+            <w:r>
+              <w:t>Commission Hazard support; cool and excavate the seal; recover and claim the Io artifact and battery.</w:t>
             </w:r>
           </w:p>
         </w:tc>
@@ -3933,14 +3803,8 @@
             <w:shd w:val="clear" w:color="auto" w:fill="F5F7F9"/>
           </w:tcPr>
           <w:p>
-            <w:pPr>
-              <w:spacing w:before="40" w:after="60" w:line="252" w:lineRule="auto"/>
-            </w:pPr>
-            <w:r>
-              <w:rPr>
-                <w:sz w:val="20"/>
-              </w:rPr>
-              <w:t>Recommend Saturn; other courses remain approachable.</w:t>
+            <w:r>
+              <w:t>Earth service recommended; Titan next.</w:t>
             </w:r>
           </w:p>
         </w:tc>
@@ -3961,15 +3825,8 @@
             <w:shd w:val="clear" w:color="auto" w:fill="FFFFFF"/>
           </w:tcPr>
           <w:p>
-            <w:pPr>
-              <w:spacing w:before="40" w:after="60" w:line="252" w:lineRule="auto"/>
-            </w:pPr>
-            <w:r>
-              <w:rPr>
-                <w:color w:val="000000"/>
-                <w:sz w:val="20"/>
-              </w:rPr>
-              <w:t>Saturn</w:t>
+            <w:r>
+              <w:t>Titan</w:t>
             </w:r>
           </w:p>
         </w:tc>
@@ -3985,14 +3842,7 @@
             <w:shd w:val="clear" w:color="auto" w:fill="FFFFFF"/>
           </w:tcPr>
           <w:p>
-            <w:pPr>
-              <w:spacing w:before="40" w:after="60" w:line="252" w:lineRule="auto"/>
-            </w:pPr>
-            <w:r>
-              <w:rPr>
-                <w:color w:val="000000"/>
-                <w:sz w:val="20"/>
-              </w:rPr>
+            <w:r>
               <w:t>Artifact recovery</w:t>
             </w:r>
           </w:p>
@@ -4009,14 +3859,8 @@
             <w:shd w:val="clear" w:color="auto" w:fill="FFFFFF"/>
           </w:tcPr>
           <w:p>
-            <w:pPr>
-              <w:spacing w:before="40" w:after="60" w:line="252" w:lineRule="auto"/>
-            </w:pPr>
-            <w:r>
-              <w:rPr>
-                <w:sz w:val="20"/>
-              </w:rPr>
-              <w:t>Protected Saturn battery expedition on a landable satellite. TBD S3: objective binding.</w:t>
+            <w:r>
+              <w:t>Survey, excavate, recover, and claim the Titan artifact and battery.</w:t>
             </w:r>
           </w:p>
         </w:tc>
@@ -4032,14 +3876,8 @@
             <w:shd w:val="clear" w:color="auto" w:fill="FFFFFF"/>
           </w:tcPr>
           <w:p>
-            <w:pPr>
-              <w:spacing w:before="40" w:after="60" w:line="252" w:lineRule="auto"/>
-            </w:pPr>
-            <w:r>
-              <w:rPr>
-                <w:sz w:val="20"/>
-              </w:rPr>
-              <w:t>Recommend Uranus; return home remains an option.</w:t>
+            <w:r>
+              <w:t>Earth service recommended; Titania next.</w:t>
             </w:r>
           </w:p>
         </w:tc>
@@ -4060,15 +3898,8 @@
             <w:shd w:val="clear" w:color="auto" w:fill="F5F7F9"/>
           </w:tcPr>
           <w:p>
-            <w:pPr>
-              <w:spacing w:before="40" w:after="60" w:line="252" w:lineRule="auto"/>
-            </w:pPr>
-            <w:r>
-              <w:rPr>
-                <w:color w:val="000000"/>
-                <w:sz w:val="20"/>
-              </w:rPr>
-              <w:t>Uranus</w:t>
+            <w:r>
+              <w:t>Titania</w:t>
             </w:r>
           </w:p>
         </w:tc>
@@ -4084,15 +3915,8 @@
             <w:shd w:val="clear" w:color="auto" w:fill="F5F7F9"/>
           </w:tcPr>
           <w:p>
-            <w:pPr>
-              <w:spacing w:before="40" w:after="60" w:line="252" w:lineRule="auto"/>
-            </w:pPr>
-            <w:r>
-              <w:rPr>
-                <w:color w:val="000000"/>
-                <w:sz w:val="20"/>
-              </w:rPr>
-              <w:t>Neptune Vector</w:t>
+            <w:r>
+              <w:t>Artifact recovery</w:t>
             </w:r>
           </w:p>
         </w:tc>
@@ -4108,14 +3932,8 @@
             <w:shd w:val="clear" w:color="auto" w:fill="F5F7F9"/>
           </w:tcPr>
           <w:p>
-            <w:pPr>
-              <w:spacing w:before="40" w:after="60" w:line="252" w:lineRule="auto"/>
-            </w:pPr>
-            <w:r>
-              <w:rPr>
-                <w:sz w:val="20"/>
-              </w:rPr>
-              <w:t>Uranus battery expedition on a landable satellite. Retained flight-data mission connection: TBD S3.</w:t>
+            <w:r>
+              <w:t>Survey, excavate, recover, and claim the Titania artifact and battery.</w:t>
             </w:r>
           </w:p>
         </w:tc>
@@ -4131,14 +3949,8 @@
             <w:shd w:val="clear" w:color="auto" w:fill="F5F7F9"/>
           </w:tcPr>
           <w:p>
-            <w:pPr>
-              <w:spacing w:before="40" w:after="60" w:line="252" w:lineRule="auto"/>
-            </w:pPr>
-            <w:r>
-              <w:rPr>
-                <w:sz w:val="20"/>
-              </w:rPr>
-              <w:t>Recommend Neptune; no data-based movement lock.</w:t>
+            <w:r>
+              <w:t>Earth service recommended; Triton next.</w:t>
             </w:r>
           </w:p>
         </w:tc>
@@ -4159,15 +3971,8 @@
             <w:shd w:val="clear" w:color="auto" w:fill="FFFFFF"/>
           </w:tcPr>
           <w:p>
-            <w:pPr>
-              <w:spacing w:before="40" w:after="60" w:line="252" w:lineRule="auto"/>
-            </w:pPr>
-            <w:r>
-              <w:rPr>
-                <w:color w:val="000000"/>
-                <w:sz w:val="20"/>
-              </w:rPr>
-              <w:t>Neptune</w:t>
+            <w:r>
+              <w:t>Triton</w:t>
             </w:r>
           </w:p>
         </w:tc>
@@ -4183,14 +3988,7 @@
             <w:shd w:val="clear" w:color="auto" w:fill="FFFFFF"/>
           </w:tcPr>
           <w:p>
-            <w:pPr>
-              <w:spacing w:before="40" w:after="60" w:line="252" w:lineRule="auto"/>
-            </w:pPr>
-            <w:r>
-              <w:rPr>
-                <w:color w:val="000000"/>
-                <w:sz w:val="20"/>
-              </w:rPr>
+            <w:r>
               <w:t>Straylight discovery</w:t>
             </w:r>
           </w:p>
@@ -4207,14 +4005,8 @@
             <w:shd w:val="clear" w:color="auto" w:fill="FFFFFF"/>
           </w:tcPr>
           <w:p>
-            <w:pPr>
-              <w:spacing w:before="40" w:after="60" w:line="252" w:lineRule="auto"/>
-            </w:pPr>
-            <w:r>
-              <w:rPr>
-                <w:sz w:val="20"/>
-              </w:rPr>
-              <w:t>Neptune battery expedition and a Straylight lead. The Ark may be discovered earlier.</w:t>
+            <w:r>
+              <w:t>Survey, excavate, recover, and claim the Triton artifact and final battery. Only this claim reveals Straylight.</w:t>
             </w:r>
           </w:p>
         </w:tc>
@@ -4230,14 +4022,50 @@
             <w:shd w:val="clear" w:color="auto" w:fill="FFFFFF"/>
           </w:tcPr>
           <w:p>
-            <w:pPr>
-              <w:spacing w:before="40" w:after="60" w:line="252" w:lineRule="auto"/>
-            </w:pPr>
-            <w:r>
-              <w:rPr>
-                <w:sz w:val="20"/>
-              </w:rPr>
-              <w:t>Recommend Straylight; activation requires all six batteries.</w:t>
+            <w:r>
+              <w:t>Earth service recommended; Straylight revealed.</w:t>
+            </w:r>
+          </w:p>
+        </w:tc>
+      </w:tr>
+      <w:tr>
+        <w:tc>
+          <w:tcPr>
+            <w:tcW w:type="dxa" w:w="1584"/>
+          </w:tcPr>
+          <w:p>
+            <w:r>
+              <w:t>Mercury and Venus</w:t>
+            </w:r>
+          </w:p>
+        </w:tc>
+        <w:tc>
+          <w:tcPr>
+            <w:tcW w:type="dxa" w:w="2160"/>
+          </w:tcPr>
+          <w:p>
+            <w:r>
+              <w:t>Optional recoveries</w:t>
+            </w:r>
+          </w:p>
+        </w:tc>
+        <w:tc>
+          <w:tcPr>
+            <w:tcW w:type="dxa" w:w="3744"/>
+          </w:tcPr>
+          <w:p>
+            <w:r>
+              <w:t>Each physical world has one persistent artifact. Claims grant recovery rewards without batteries or route gates.</w:t>
+            </w:r>
+          </w:p>
+        </w:tc>
+        <w:tc>
+          <w:tcPr>
+            <w:tcW w:type="dxa" w:w="1872"/>
+          </w:tcPr>
+          <w:p>
+            <w:r>
+              <w:t>Optional after Moon; main route unchanged.</w:t>
             </w:r>
           </w:p>
         </w:tc>
@@ -4298,7 +4126,7 @@
         <w:pStyle w:val="ListNumber"/>
       </w:pPr>
       <w:r>
-        <w:t>Pack the expedition, ascend manually, and choose to return home or continue toward another body with the remaining resources and temporary build.</w:t>
+        <w:t>Pack the expedition, ascend manually, and choose to return home or continue toward another body with the remaining resources and expedition build.</w:t>
       </w:r>
     </w:p>
     <w:p>
@@ -4306,7 +4134,7 @@
         <w:pStyle w:val="ListNumber"/>
       </w:pPr>
       <w:r>
-        <w:t>Dock at the operational home to bank carried salvage, service the ship, end temporary progression, and install permanent ship capability. Preserve the established Drone Ops choices.</w:t>
+        <w:t>Dock at the operational home to bank carried salvage, service the ship, preserve the expedition build, and install permanent ship capability. Preserve the established Drone Ops choices.</w:t>
       </w:r>
     </w:p>
     <w:p>
@@ -7765,7 +7593,7 @@
     </w:p>
     <w:p>
       <w:r>
-        <w:t>Physical delivery allocates contract ore first; ordinary salvage enters the expedition hold and remains at risk until home docking. The initial hold carries 60 ore. Excess is rejected and remains with its physical carrier or in the site, including departure with overloaded Rig or Prospector cargo; it is never silently banked. First-full Rig and repeated ship hoarding receive contextual transmissions. Loose ore within the Rig collection field is pulled into the Rig, with an upgrade path for radius. Laser debris disappears on reaching the shaft bottom instead of pooling there. Earth banks carried cargo and payout, services fuel and hull, and ends temporary progression once. Revisits do not duplicate payouts.</w:t>
+        <w:t>Physical delivery allocates contract ore first; ordinary salvage enters the expedition hold and remains at risk until home docking. The initial ship hold carries 60 ore. The Mining Rig starts at 24 cargo capacity; Cargo Skids, Ore Hopper, and Expandable Panniers add 2, 1, and 3 capacity per rank. Load bands remain proportional to capacity. Excess stays with its physical carrier or in the site and is never silently banked. Loose ore within the effective drill footprint is collectible; Ore Magnet adds reach beyond the tool. Earth banks carried cargo and payout, services fuel and hull, and preserves the expedition build. Revisits do not duplicate payouts.</w:t>
       </w:r>
     </w:p>
     <w:tbl>
@@ -8434,7 +8262,7 @@
     </w:tbl>
     <w:p>
       <w:r>
-        <w:t>Progression artifacts use deterministic placement and cached target layers. The lunar anomaly belongs to the first scanned Moon sector once per campaign; existing saved placement and completion are preserved. Its EVA tunnel is offset six cells from the previous anchor so it lies beside the laser shaft. Other sectors provide ordinary mining content. Later authored artifact placements retain their progression curve. Collected artifacts and completed objectives never regenerate on revisits, reloads or recovery.</w:t>
+        <w:t>Each landable solar mining world owns one deterministic, persistent artifact tied to its physical body and sector. Scanner pulses must physically reach the artifact before reveal, and tethered delivery to the ship records recovery. The six main artifacts have fixed stage depths; optional Mercury and Venus recoveries do not deepen later missions. Mission artifacts cannot be permanently destroyed, remain recoverable with a full ore hold, and never regenerate after recovery.</w:t>
       </w:r>
     </w:p>
     <w:p>
@@ -8455,7 +8283,49 @@
     </w:p>
     <w:p>
       <w:r>
-        <w:t>Expedition XP creates survivor-style Level Up drafts during a Surface run. Picks can rank the Mining Rig, rank every equipped copy of one Support Drone type, graft a module to one occupied slot, or activate a named loadout synergy; these benefits last for the Transport expedition rather than becoming permanent material purchases. Combat-tagged choices such as Resonant Discharge are excluded, and stale combat drafts are rerolled without consuming the pick, until the campaign has recorded its first hostile encounter.</w:t>
+        <w:t>Expedition XP creates survivor-style Level Up drafts during a Surface run. Picks can rank the Mining Rig, rank every equipped copy of one Support Drone type, graft a module to one occupied slot, or activate a named loadout synergy. The build lasts until the main ship is destroyed or abandoned. Docking, changing worlds, Rig loss, Rig recovery, and Rig replacement preserve level, XP, pending choices, ranks, grafts, and synergies. Combat-tagged choices remain unavailable until the campaign records its first hostile encounter.</w:t>
+      </w:r>
+    </w:p>
+    <w:p>
+      <w:pPr>
+        <w:pStyle w:val="Heading3"/>
+      </w:pPr>
+      <w:r>
+        <w:t>Drill Upgrade Curriculum</w:t>
+      </w:r>
+    </w:p>
+    <w:p>
+      <w:pPr/>
+      <w:r>
+        <w:t>The starter Mining Rig cuts 20 percent faster than the previous baseline. High-Torque Motor adds 25 percent of the improved starter cutting power per rank. Wide Drill Head adds 25 percent of the original head width per rank without adding reach. Side Cutters add 0.5 cells of reach on each side per rank and cut at 60 percent power. Hard-Rock Teeth add 25 percent power against Hard Rock per rank. Coolant Mist reduces drilling heat generation by 15 percentage points per rank. Each track has three ranks and stacks additively within its category.</w:t>
+      </w:r>
+    </w:p>
+    <w:p>
+      <w:pPr>
+        <w:pStyle w:val="Heading3"/>
+      </w:pPr>
+      <w:r>
+        <w:t>Drill Geometry and Efficiency</w:t>
+      </w:r>
+    </w:p>
+    <w:p>
+      <w:pPr/>
+      <w:r>
+        <w:t>The rendered drill, terrain contact, movement collision, and clearance checks use the same upgraded geometry. Side cutters operate only beside the forward main drill and never cut behind the Rig or past protected boundaries. Overlapping contacts damage a cell once at the stronger value. Fuel use and heat exposure remain time based, so wider contact does not multiply operating cost. Upgrade installation revalidates the current pose and must not teleport or trap the Rig.</w:t>
+      </w:r>
+    </w:p>
+    <w:p>
+      <w:pPr>
+        <w:pStyle w:val="Heading3"/>
+      </w:pPr>
+      <w:r>
+        <w:t>Upgrade Draft Guarantees</w:t>
+      </w:r>
+    </w:p>
+    <w:p>
+      <w:pPr/>
+      <w:r>
+        <w:t>Every three-card draft includes an eligible drill upgrade while drill ranks remain. The first draft includes High-Torque Motor I and one width track. The other width track appears by the third draft unless already owned. Cards show cutting power, head width, side reach, heat reduction, and capacity before and after.</w:t>
       </w:r>
     </w:p>
     <w:tbl>
@@ -9195,7 +9065,7 @@
     </w:p>
     <w:p>
       <w:r>
-        <w:t>The first Moon mission uses a simple Retry launch recovery instead of introducing course plotting, dock and shipyard after failure. Mission Control uses the concerned portrait: the first crash reassures, the second gives tips, the third makes the crater-record remark, and fourth and later crashes return to tips. Overheating receives cause-specific guidance. Later expedition loss creates a persistent wreck with carried salvage and unbanked payout. A viable replacement appears at home; installed capability persists while temporary progression resets. Recover wreck cargo by approaching its signal and using Salvage. Excess remains at the wreck.</w:t>
+        <w:t>The first Moon mission uses a simple Retry launch recovery after failure. Later main-ship loss or Abandon Ship creates a persistent wreck with carried salvage, batteries, unbanked payout, and the earned expedition build. A viable replacement starts with a fresh build at home. Wreck salvage restores build data even with a full hold; leftover ore remains recoverable. Duplicate upgrade ranks keep the higher rank, distinct upgrades and synergies merge, and conflicting grafts require an explicit player choice. The wreck grants its build only once.</w:t>
       </w:r>
     </w:p>
     <w:p>
@@ -9237,7 +9107,7 @@
         <w:jc w:val="center"/>
       </w:pPr>
       <w:r>
-        <w:t>The solar system includes Earth and its service dock, Mercury, Venus, Moon, Mars, Jupiter and Io, Saturn and Titan, Uranus and Titania, Neptune and Triton, and derelict Straylight. Gas giants are orbital environments; their satellite sites provide terrain expeditions. Mercury and Venus reuse geology while retaining distinct spatial/site identities and do not duplicate Moon or Mars campaign objectives.</w:t>
+        <w:t>The solar system includes Earth and its service dock, Mercury, Venus, Moon, Mars, Jupiter and Io, Saturn and Titan, Uranus and Titania, Neptune and Triton, and derelict Straylight. Gas giants are visible orbital landmarks; Io, Titan, Titania, and Triton provide their mining expeditions. A new campaign charts only Sun, Earth, and Moon. Claims reveal the next main system, while Straylight remains absent from rendering, targeting, collision, preview, and messages until the Triton claim.</w:t>
       </w:r>
     </w:p>
     <w:tbl>
@@ -9484,15 +9354,8 @@
             <w:vAlign w:val="center"/>
           </w:tcPr>
           <w:p>
-            <w:pPr>
-              <w:spacing w:before="40" w:after="60" w:line="252" w:lineRule="auto"/>
-            </w:pPr>
-            <w:r>
-              <w:rPr>
-                <w:color w:val="000000"/>
-                <w:sz w:val="20"/>
-              </w:rPr>
-              <w:t>First lunar mining, Prospector and EVA anomaly; opening pacing TBD S1/S2.</w:t>
+            <w:r>
+              <w:t>First mining contract, persistent artifact, Moon battery, Prospector, and optional inner-world discoveries.</w:t>
             </w:r>
           </w:p>
         </w:tc>
@@ -9515,14 +9378,7 @@
             <w:vAlign w:val="center"/>
           </w:tcPr>
           <w:p>
-            <w:pPr>
-              <w:spacing w:before="40" w:after="60" w:line="252" w:lineRule="auto"/>
-            </w:pPr>
-            <w:r>
-              <w:rPr>
-                <w:color w:val="000000"/>
-                <w:sz w:val="20"/>
-              </w:rPr>
+            <w:r>
               <w:t>No enemies.</w:t>
             </w:r>
           </w:p>
@@ -9613,15 +9469,8 @@
             <w:vAlign w:val="center"/>
           </w:tcPr>
           <w:p>
-            <w:pPr>
-              <w:spacing w:before="40" w:after="60" w:line="252" w:lineRule="auto"/>
-            </w:pPr>
-            <w:r>
-              <w:rPr>
-                <w:color w:val="000000"/>
-                <w:sz w:val="20"/>
-              </w:rPr>
-              <w:t>Second industrial contract and Drone Bay expansion; economy TBD S2.</w:t>
+            <w:r>
+              <w:t>Second ore contract, persistent artifact, Mars battery, Slot 2, and Io discovery.</w:t>
             </w:r>
           </w:p>
         </w:tc>
@@ -9644,14 +9493,7 @@
             <w:vAlign w:val="center"/>
           </w:tcPr>
           <w:p>
-            <w:pPr>
-              <w:spacing w:before="40" w:after="60" w:line="252" w:lineRule="auto"/>
-            </w:pPr>
-            <w:r>
-              <w:rPr>
-                <w:color w:val="000000"/>
-                <w:sz w:val="20"/>
-              </w:rPr>
+            <w:r>
               <w:t>Environmental hazards only.</w:t>
             </w:r>
           </w:p>
@@ -9742,14 +9584,8 @@
             <w:vAlign w:val="center"/>
           </w:tcPr>
           <w:p>
-            <w:pPr>
-              <w:spacing w:before="40" w:after="60" w:line="252" w:lineRule="auto"/>
-            </w:pPr>
-            <w:r>
-              <w:rPr>
-                <w:sz w:val="20"/>
-              </w:rPr>
-              <w:t>Jupiter gravity assist and Io Hazard Drone/artifact and battery expedition. TBD S3: campaign integration.</w:t>
+            <w:r>
+              <w:t>Visible gas giant landmark; Io carries the Hazard Drone mission, persistent artifact, and battery.</w:t>
             </w:r>
           </w:p>
         </w:tc>
@@ -9772,14 +9608,7 @@
             <w:vAlign w:val="center"/>
           </w:tcPr>
           <w:p>
-            <w:pPr>
-              <w:spacing w:before="40" w:after="60" w:line="252" w:lineRule="auto"/>
-            </w:pPr>
-            <w:r>
-              <w:rPr>
-                <w:color w:val="000000"/>
-                <w:sz w:val="20"/>
-              </w:rPr>
+            <w:r>
               <w:t>No enemies.</w:t>
             </w:r>
           </w:p>
@@ -9870,14 +9699,8 @@
             <w:vAlign w:val="center"/>
           </w:tcPr>
           <w:p>
-            <w:pPr>
-              <w:spacing w:before="40" w:after="60" w:line="252" w:lineRule="auto"/>
-            </w:pPr>
-            <w:r>
-              <w:rPr>
-                <w:sz w:val="20"/>
-              </w:rPr>
-              <w:t>Saturn satellite battery expedition; flexible onward or return course. TBD S3: integration.</w:t>
+            <w:r>
+              <w:t>Visible gas giant landmark; Titan carries the persistent artifact and battery mission.</w:t>
             </w:r>
           </w:p>
         </w:tc>
@@ -9900,14 +9723,7 @@
             <w:vAlign w:val="center"/>
           </w:tcPr>
           <w:p>
-            <w:pPr>
-              <w:spacing w:before="40" w:after="60" w:line="252" w:lineRule="auto"/>
-            </w:pPr>
-            <w:r>
-              <w:rPr>
-                <w:color w:val="000000"/>
-                <w:sz w:val="20"/>
-              </w:rPr>
+            <w:r>
               <w:t>No enemies.</w:t>
             </w:r>
           </w:p>
@@ -9998,14 +9814,8 @@
             <w:vAlign w:val="center"/>
           </w:tcPr>
           <w:p>
-            <w:pPr>
-              <w:spacing w:before="40" w:after="60" w:line="252" w:lineRule="auto"/>
-            </w:pPr>
-            <w:r>
-              <w:rPr>
-                <w:sz w:val="20"/>
-              </w:rPr>
-              <w:t>Uranus satellite battery expedition. Flight-data story relationship: TBD S3.</w:t>
+            <w:r>
+              <w:t>Visible gas giant landmark; Titania carries the persistent artifact and battery mission.</w:t>
             </w:r>
           </w:p>
         </w:tc>
@@ -10028,14 +9838,7 @@
             <w:vAlign w:val="center"/>
           </w:tcPr>
           <w:p>
-            <w:pPr>
-              <w:spacing w:before="40" w:after="60" w:line="252" w:lineRule="auto"/>
-            </w:pPr>
-            <w:r>
-              <w:rPr>
-                <w:color w:val="000000"/>
-                <w:sz w:val="20"/>
-              </w:rPr>
+            <w:r>
               <w:t>No enemies.</w:t>
             </w:r>
           </w:p>
@@ -10126,14 +9929,8 @@
             <w:vAlign w:val="center"/>
           </w:tcPr>
           <w:p>
-            <w:pPr>
-              <w:spacing w:before="40" w:after="60" w:line="252" w:lineRule="auto"/>
-            </w:pPr>
-            <w:r>
-              <w:rPr>
-                <w:sz w:val="20"/>
-              </w:rPr>
-              <w:t>Neptune satellite battery expedition and Ark lead; early Ark discovery is allowed.</w:t>
+            <w:r>
+              <w:t>Visible gas giant landmark; Triton carries the final artifact and battery, and its claim reveals Straylight.</w:t>
             </w:r>
           </w:p>
         </w:tc>
@@ -10156,14 +9953,7 @@
             <w:vAlign w:val="center"/>
           </w:tcPr>
           <w:p>
-            <w:pPr>
-              <w:spacing w:before="40" w:after="60" w:line="252" w:lineRule="auto"/>
-            </w:pPr>
-            <w:r>
-              <w:rPr>
-                <w:color w:val="000000"/>
-                <w:sz w:val="20"/>
-              </w:rPr>
+            <w:r>
               <w:t>No enemies.</w:t>
             </w:r>
           </w:p>
@@ -11389,7 +11179,7 @@
         <w:pStyle w:val="ListBullet"/>
       </w:pPr>
       <w:r>
-        <w:t>Message delivery and persistence. Pending occurrences retain their order and stable IDs in v21 saves. Campaign-once messages retain acknowledgements across visits; repeatable messages require distinct occurrence IDs. Missing message state defaults safely without a campaign reset. Cards pause oxygen, movement, resource use, damage and mining clocks, and queue behind XP choices, deployment, depth transitions and failure resolution. Escape cannot acknowledge or dismiss them. Held movement and tools must be released before resuming.</w:t>
+        <w:t>Message delivery and persistence. Pending occurrences retain their order and stable IDs in v23 saves. Campaign-once messages retain acknowledgements across visits; repeatable messages require distinct occurrence IDs. Missing message state defaults safely without a campaign reset. Cards pause oxygen, movement, resource use, damage and mining clocks, and queue behind XP choices, deployment, depth transitions and failure resolution. Escape cannot acknowledge or dismiss them. Held movement and tools must be released before resuming.</w:t>
       </w:r>
     </w:p>
     <w:p>
@@ -12091,7 +11881,7 @@
     </w:tbl>
     <w:p>
       <w:r>
-        <w:t>Mining uses separate Rig/EVA pose, integrity and oxygen, physical loose objects, vector gravity, cached layers, and deterministic placement. ExpeditionProgressionState owns XP, pending picks, ranks, graft assignments/runtime, and synergies independently of a planetary site. These survive cross-body visits and reset at operational-home docking or expedition loss. SystemContent owns authored transforms and site identities; FlightRunState owns live ship pose and resources. SystemLocation records the coordinate frame and persistence boundary. Course planning, cruise input, site registry, campaign events, recovery, and presentation have separate ownership. Render snapshots never relocate the ship or grant resources.</w:t>
+        <w:t>Mining uses separate Rig/EVA pose, integrity and oxygen, physical loose objects, vector gravity, cached layers, and deterministic placement. ExpeditionProgressionState owns XP, pending picks, ranks, graft assignments/runtime, and synergies independently of a planetary site. These survive cross-body visits, Rig loss, and operational-home docking. Main-ship loss stores the build in its recoverable wreck and starts the replacement with a fresh build. SystemContent owns authored transforms and site identities; FlightRunState owns live ship pose and resources. SystemLocation records the coordinate frame and persistence boundary. Course planning, cruise input, site registry, campaign events, recovery, and presentation have separate ownership. Render snapshots never relocate the ship or grant resources.</w:t>
       </w:r>
     </w:p>
     <w:p>
@@ -12104,9 +11894,8 @@
     </w:p>
     <w:p>
       <w:r>
-        <w:t>Scenario definitions provide eligibility, dependent steps, completion rules, explicit claims and rewards. Typed events record physical deliveries, protected-objective recovery and other results. The Moon 20-ore delivery activates the anomaly but does not grant a Prospector. Confirming the first artifact recovery grants and equips Prospector MK I, Slot 1 and the Mars lead, then queues Meet your Prospector. Its base Common Ore mining cycle is five seconds; ranks improve the rate. Already earned drones remain owned across save migration and rewards cannot duplicate. Initialized solar expeditions never open the retired route activities or relocate the ship when a scenario advances. Battery and Ark integration remain TBD S3/S4.</w:t>
+        <w:t>Scenario definitions provide eligibility, dependent steps, completion rules, explicit claims, rewards, messages, discoveries, and the next recommended mission. Typed events identify the physical body, so shared geology cannot complete another world's objective. The Moon 20-ore delivery activates its anomaly; claiming the recovered artifact grants Prospector MK I, Slot 1, and the Mars route. Mars requires 8 Common Ore and its artifact. Io requires Hazard support and its protected recovery. Titan, Titania, and Triton continue the artifact chain. Claims grant rewards in place without relocating the ship, forcing departure, or opening another gameplay screen.</w:t>
       </w:r>
-      <w:r/>
     </w:p>
     <w:p>
       <w:pPr>
@@ -12118,7 +11907,7 @@
     </w:p>
     <w:p>
       <w:r>
-        <w:t>The campaign accepts version-21 saves. Incompatible or malformed payloads are preserved until explicit New Campaign confirmation. Physical pose, coordinate frame, resources, parked ship, cached terrain, actors, cargo, wrecks and campaign progress persist. Optional site records retain each system/body/sector scan, excavation, layers and objective state, including sites never landed on. Older records use their stored sector or the original sector fallback. Restore site state without rolling back inventory, upgrades or campaign progress. Preserve existing tutorial anomaly placement and completion; assign the first scanned wedge only when no prior assignment or generated tutorial site exists. Missing optional fields default safely. Legacy compatibility records do not authorize regenerating or moving actors. Retired v21 activity screens resume physical flight at a safe approach only when no physical pose exists. Recorded physical position and momentum are retained. Historical transfer-assist records grant no fuel discount, speed boost or instability penalty. Saved scenario identifiers remain stable so completed objectives and rewards stay completed.</w:t>
+        <w:t>Save schema v23 is the only accepted campaign format. Older and malformed campaign saves go directly to the existing new-game flow with clear older-campaign copy. No migration, reconciliation, legacy activity repair, progression inference, or remote-Hangar restoration is retained. Physical pose, coordinate frame, resources, sites, terrain, artifacts, batteries, waypoints, messages, discoveries, cargo, drill ranks, draft guarantees, recoverable wreck builds, and scenario claims persist directly in v23.</w:t>
       </w:r>
     </w:p>
     <w:p>
@@ -13088,7 +12877,7 @@
         <w:pStyle w:val="Heading2"/>
       </w:pPr>
       <w:r>
-        <w:t>Unresolved Story and Progression</w:t>
+        <w:t>Current Decisions and Open Work</w:t>
       </w:r>
     </w:p>
     <w:p>
@@ -13096,7 +12885,7 @@
         <w:pStyle w:val="ListBullet"/>
       </w:pPr>
       <w:r>
-        <w:t>TBD S1 Further teaching and pacing. The implemented opening uses a one-second fade, Launch-triggered instruction, cause-aware crash retries and contextual messages for dock approach, hard landings, full cargo, lunar discovery and the first Prospector. Before the first Moon mission completes, dock instruction explains the dock and redirects the player to the Moon; afterward it omits the redirect. Preserve the distinction between orbital survey and the surface-scanner anomaly lesson. Further playtesting should refine timing and clarity without adding redundant text.</w:t>
+        <w:t>TBD S1 Further teaching and pacing. The implemented opening uses a one-second fade, Launch-triggered instruction, cause-aware crash retries and contextual messages for dock approach, hard landings, full cargo, lunar discovery and the first Prospector. Every solar mission has concise pre-mission objectives, an in-mission checklist, and one post-claim completion message. Further playtesting should refine timing and clarity without adding redundant text.</w:t>
       </w:r>
     </w:p>
     <w:p>
@@ -13104,7 +12893,7 @@
         <w:pStyle w:val="ListBullet"/>
       </w:pPr>
       <w:r>
-        <w:t>TBD S2 Expedition economy tuning. The deterministic Rank I home shipyard and carried-versus-banked economy operate in solar expeditions. Tune travel duration, burn/coast pressure, servicing, and next-rank benefits through play without changing established Drone choices, XP thresholds, reward amounts, or Moon/Mars contract allocations. Bind two/four-battery research to the physical missions in S3. Physical ship-propellant and hull-repair field supplies require distinct inventories and interactions; Rig fuel-cell credit cannot fund either.</w:t>
+        <w:t>TBD S2 Expedition economy tuning. The deterministic Rank I home shipyard and carried-versus-banked economy operate in solar expeditions. Tune travel duration, burn/coast pressure, servicing, and next-rank benefits through play without changing established Drone choices, XP thresholds, reward amounts, or Moon and Mars allocations. Rank II and III research remains tied to two and four distinct stored main batteries.</w:t>
       </w:r>
     </w:p>
     <w:p>
@@ -13112,7 +12901,7 @@
         <w:pStyle w:val="ListBullet"/>
       </w:pPr>
       <w:r>
-        <w:t>TBD S3 Battery missions and flexible campaign order. Preserve Moon/Mars contracts and the Io Hazard Drone sequence within open solar travel. Bind six unique protected-objective batteries to Moon, Mars, Io, Saturn, Uranus, and Neptune sites, using satellites for giant environments. Earth must store carried batteries and subsequently load them for transport to Straylight; losses must leave exactly one recoverable owner. Early Ark discovery is allowed; explicit activation requires all six installed. Physical site binding, battery transfer interfaces, and out-of-order acknowledgement reconciliation remain to implement. Jupiter gravity assists must provide real flight efficiency without a mandatory grade gate.</w:t>
+        <w:t>S3 Solar artifact progression is canonical. Main missions run Moon, Mars, Io, Titan, Titania, and Triton. Mercury and Venus are optional after the Moon. Every landing world has one physical artifact; the six main artifacts carry the six batteries. Recovery, claims, route discovery, Earth recommendations, player-selected waypoints, Earth Storage, wreck ownership, and two/four-battery research are independent saved state. Only the Triton claim reveals Straylight. Players may return to Earth, continue onward, revisit worlds, or complete optional recoveries whenever their routes are available.</w:t>
       </w:r>
     </w:p>
     <w:p>
@@ -13120,8 +12909,7 @@
         <w:pStyle w:val="ListBullet"/>
       </w:pPr>
       <w:r>
-        <w:lastRenderedPageBreak/>
-        <w:t>TBD S4 Ark and endgame integration. Straylight becomes the operational home only through explicit six-battery activation. The derelict accepts partial installations but provides no full servicing or replacement-home recovery. Preserve friendly Aaru Vale, Arkfall, hostile Khepri Prime, Rift Belt, Ouroboros, and Ascent. Use the same body/site travel contracts for these expeditions; define remaining Aaru Vale objectives, repair thresholds, deeper navigation, and the concrete New Earth objective.</w:t>
+        <w:t>TBD S4 Ark and endgame integration. After the Triton claim, Straylight is a reachable derelict dock without service or activation in the solar progression scope. Battery installation, Ark activation, changing the service home, friendly Aaru Vale, Arkfall, hostile Khepri Prime, Rift Belt, Ouroboros, Ascent, and the concrete New Earth objective remain later work.</w:t>
       </w:r>
     </w:p>
     <w:p>

</xml_diff>

<commit_message>
Add Straylight progression and polish
</commit_message>
<xml_diff>
--- a/docs/Rocket_Rogue_Game_Design_Document.docx
+++ b/docs/Rocket_Rogue_Game_Design_Document.docx
@@ -418,7 +418,6 @@
         <w:pageBreakBefore/>
       </w:pPr>
       <w:r>
-        <w:lastRenderedPageBreak/>
         <w:t>Document Map</w:t>
       </w:r>
     </w:p>
@@ -1021,7 +1020,6 @@
       </w:pPr>
       <w:bookmarkStart w:id="0" w:name="GDDSection1"/>
       <w:r>
-        <w:lastRenderedPageBreak/>
         <w:t>1 Executive Overview</w:t>
       </w:r>
       <w:bookmarkEnd w:id="0"/>
@@ -1612,7 +1610,6 @@
         <w:t xml:space="preserve">Primary audience: PC players who want roguelite pressure, distinctive critter crews, ship and drone loadouts, aerospace fantasy, and mining/extraction decisions without real-money gambling mechanics. The long-term target platform is Steam; current distribution uses portable native Windows/Linux </w:t>
       </w:r>
       <w:r>
-        <w:lastRenderedPageBreak/>
         <w:t>archives and a separate WebGL build that tests and shares the same core game. Steamworks integration is future work, not part of the current platform layer.</w:t>
       </w:r>
     </w:p>
@@ -2151,7 +2148,6 @@
         <w:pStyle w:val="Heading2"/>
       </w:pPr>
       <w:r>
-        <w:lastRenderedPageBreak/>
         <w:t>Numbered Chapter Map</w:t>
       </w:r>
     </w:p>
@@ -3335,7 +3331,6 @@
         <w:pStyle w:val="ListBullet"/>
       </w:pPr>
       <w:r>
-        <w:lastRenderedPageBreak/>
         <w:t>Chapter 5 keeps combat off the board. Aaru Vale teaches search, discovery, and mining while Straylight is still operational; enemies begin after Arkfall.</w:t>
       </w:r>
     </w:p>
@@ -4006,7 +4001,7 @@
           </w:tcPr>
           <w:p>
             <w:r>
-              <w:t>Survey, excavate, recover, and claim the Triton artifact and final battery. Only this claim reveals Straylight.</w:t>
+              <w:t>Survey, excavate, and deliver the Triton artifact into the ship. Delivery immediately reveals Straylight and sets its waypoint.</w:t>
             </w:r>
           </w:p>
         </w:tc>
@@ -4023,7 +4018,7 @@
           </w:tcPr>
           <w:p>
             <w:r>
-              <w:t>Earth service recommended; Straylight revealed.</w:t>
+              <w:t>Straylight waypoint set immediately. Earth retrieval follows first contact.</w:t>
             </w:r>
           </w:p>
         </w:tc>
@@ -4163,7 +4158,7 @@
     <w:p>
       <w:pPr/>
       <w:r>
-        <w:t>C or controller left-stick click toggles cruise. Cruise uses ordinary steering and forward thrust toward the selected body center, with no braking, avoidance, capture assistance, fuel advantage, or destination protection. Manual steering or thrust cancels it immediately. Map inspection pauses simulation and visibly identifies cruise that will resume on closing. Earth docking requires rendezvous with its orbital marker within 0.32 system units at no more than 0.20 relative speed and an explicit Dock action; choosing Earth on the map does not dock or service the ship. Plot course immediately exposes target guidance and a brief manual-flight or active-cruise notice. At home, Depart dock enters a ready view; the dock holds the ship until forward thrust releases it and applies ordinary thrust in the same step. No velocity grant or protection persists after undocking. The Earth service dock is 1.962 units toward the Moon from Earth center, outside every local gravity region including its full docking range. Dock offsets belong to system content. Explicitly attached Earth dock saves follow the current marker, preserving resources and heading; free-flight and surface positions remain unchanged.</w:t>
+        <w:t>C or controller left-stick click toggles cruise. Cruise uses ordinary steering and forward thrust toward the selected body center, with no braking, avoidance, capture assistance, fuel advantage, or destination protection. Manual steering or thrust cancels it immediately. Map inspection pauses simulation and visibly identifies cruise that will resume on closing. Earth docking requires rendezvous with its orbital marker within 2 system units at no more than 1.0 relative speed and an explicit Dock action; choosing Earth on the map does not dock or service the ship. Plot course immediately exposes target guidance and a brief manual-flight or active-cruise notice. At home, Depart dock enters a ready view; the dock holds the ship until forward or lateral thrust releases it and applies ordinary thrust in the same step. No velocity grant or protection persists after undocking. The Earth service dock is 1.962 units toward the Moon from Earth center, outside every local gravity region including its full docking range. Dock offsets belong to system content. Explicitly attached Earth dock saves follow the current marker, preserving resources and heading; free-flight and surface positions remain unchanged.</w:t>
       </w:r>
     </w:p>
     <w:p>
@@ -4176,7 +4171,7 @@
     </w:p>
     <w:p>
       <w:r>
-        <w:t>One physical Flight simulation owns Travel, Orbit and Landing. The opening Launch action presents the saved Mission Control transmission before releasing the departure impulse. A/D rotate; W thrusts along the nose and S reverses. Keyboard thrust ramps over 0.40 seconds and release cuts immediately; analog input is proportional. Coasting spends no propulsion fuel. Powered heat accumulation is reduced for forgiving correction burns; the first Moon mission also receives four times the normal thermal failure grace. Position, velocity, fuel, heat and hull remain authoritative.</w:t>
+        <w:t>One physical Flight simulation owns Travel, Orbit and Landing. The opening Launch action presents the saved Mission Control transmission before releasing the departure impulse. Q/E rotate; A/D strafe relative to the ship; W thrusts along the nose and S reverses. On controller, left/right shoulders rotate and the left stick controls lateral and forward/reverse thrust. Lateral thrusters provide half the main engine acceleration, consume propulsion fuel and generate heat, and cancel cruise when used. Keyboard forward/reverse thrust ramps over 0.40 seconds and release cuts immediately; analog input is proportional. Coasting spends no propulsion fuel. Powered heat accumulation is reduced for forgiving correction burns; the first Moon mission also receives four times the normal thermal failure grace. Position, velocity, fuel, heat and hull remain authoritative.</w:t>
       </w:r>
     </w:p>
     <w:tbl>
@@ -4659,7 +4654,7 @@
     </w:p>
     <w:p>
       <w:r>
-        <w:t>Local Landing runs physics and resources in real seconds. Gravity is 3 m/s²; forward and reverse thrust are 6 and 3 m/s². Rotation targets 75 degrees per second with a 0.15-second response and no automatic leveling. The shuttle footprint collides with the actual cached terrain, including underground layers at four metres per cell. Impact damage is max(0, inward contact speed minus 8) times 5 hull points, including rotation. The first contact with real support and rig staging clearance commits touchdown when the ship is within 30 degrees of upright, including small upward drift reported by collision integration; the launch-support latch prevents intentional ascent from relanding. There is no separate touchdown speed cap: impact damage decides survival. Other surviving contacts rebound and control continues. Planet-body contact outside local Landing is fatal.</w:t>
+        <w:t>Local Landing runs physics and resources in real seconds. Gravity is 3 m/s²; forward, reverse and lateral thrust are 6, 3 and 3 m/s². Rotation targets 75 degrees per second with a 0.15-second response and no automatic leveling. The shuttle footprint collides with the actual cached terrain, including underground layers at four metres per cell. Impact damage is max(0, inward contact speed minus 8) times 5 hull points, including rotation. The first contact with real support and rig staging clearance commits touchdown when the ship is within 30 degrees of upright, including small upward drift reported by collision integration; the launch-support latch prevents intentional ascent from relanding. There is no separate touchdown speed cap: impact damage decides survival. Other surviving contacts rebound and control continues. Planet-body contact outside local Landing is fatal.</w:t>
       </w:r>
     </w:p>
     <w:p>
@@ -4681,7 +4676,6 @@
         <w:pStyle w:val="Heading3"/>
       </w:pPr>
       <w:r>
-        <w:lastRenderedPageBreak/>
         <w:t>Touchdown and Deployment</w:t>
       </w:r>
     </w:p>
@@ -6131,7 +6125,6 @@
     </w:p>
     <w:p>
       <w:r>
-        <w:lastRenderedPageBreak/>
         <w:t>Suit-only passages admit the operator, Support Drones and towed artifacts; they block the Rig. The operator may change depth while the parked rig stays on its layer; the operator, validly tethered artifact, and drone companions transition together. Runs start in the rig. Exit needs a safe adjacent suit position; entry needs the same layer within 1.25 cells. Rig destruction emergency-ejects the operator safely and disables the wreck before combat updates. Cargo stays with the wreck, stowed ship payload stays safe, and an operator-tethered artifact stays attached.</w:t>
       </w:r>
     </w:p>
@@ -8315,6 +8308,12 @@
       </w:r>
     </w:p>
     <w:p>
+      <w:pPr/>
+      <w:r>
+        <w:t>Drill contact identifies hard rock as drillable, bedrock as requiring a route around it, ordinary hazards as treatable or avoidable, and protected seals as requiring Hazard support. Contact labels and symbols use the actual Rig or EVA cutting footprint. Distinct existing mechanical, rejection and warning sounds reinforce these states at a limited repeat rate. Hidden objective seals remain concealed until revealed.</w:t>
+      </w:r>
+    </w:p>
+    <w:p>
       <w:pPr>
         <w:pStyle w:val="Heading3"/>
       </w:pPr>
@@ -9069,6 +9068,12 @@
       </w:r>
     </w:p>
     <w:p>
+      <w:pPr/>
+      <w:r>
+        <w:t>The first later ship loss opens a saved, explicitly acknowledged salvage explanation at the home dock. Artifact-bearing wrecks use a purple diamond and an Artifact / Wreck label in flight and waypoint guidance. After recovering the artifact, any remaining ore wreck returns to its ordinary marker. Nearby salvage controls explain speed matching and full-hold recovery of artifacts and upgrades. Earth Storage remains safe.</w:t>
+      </w:r>
+    </w:p>
+    <w:p>
       <w:pPr>
         <w:spacing w:after="0" w:line="20" w:lineRule="exact"/>
         <w:sectPr>
@@ -9089,7 +9094,6 @@
       </w:pPr>
       <w:bookmarkStart w:id="4" w:name="GDDSection5"/>
       <w:r>
-        <w:lastRenderedPageBreak/>
         <w:t>5 Content Inventory</w:t>
       </w:r>
       <w:bookmarkEnd w:id="4"/>
@@ -9107,7 +9111,45 @@
         <w:jc w:val="center"/>
       </w:pPr>
       <w:r>
-        <w:t>The solar system includes Earth and its service dock, Mercury, Venus, Moon, Mars, Jupiter and Io, Saturn and Titan, Uranus and Titania, Neptune and Triton, and derelict Straylight. Gas giants are visible orbital landmarks; Io, Titan, Titania, and Triton provide their mining expeditions. A new campaign charts only Sun, Earth, and Moon. Claims reveal the next main system, while Straylight remains absent from rendering, targeting, collision, preview, and messages until the Triton claim.</w:t>
+        <w:t>The solar system includes Earth and its service dock, Mercury, Venus, Moon, Mars, Jupiter and Io, Saturn and Titan, Uranus and Titania, Neptune and Triton, and derelict Straylight. Gas giants are visible orbital landmarks; Io, Titan, Titania, and Triton provide their mining expeditions. A new campaign charts only Sun, Earth, and Moon. Claims reveal the next main system, while Straylight remains absent from rendering, targeting, collision, preview, and messages until Triton's artifact is physically delivered into the player ship. Delivery immediately reveals Straylight and sets its waypoint, before mission claim or Earth banking.</w:t>
+      </w:r>
+    </w:p>
+    <w:p>
+      <w:pPr>
+        <w:pStyle w:val="Heading2"/>
+      </w:pPr>
+      <w:r>
+        <w:t>Straylight Discovery And Departure</w:t>
+      </w:r>
+    </w:p>
+    <w:p>
+      <w:pPr/>
+      <w:r>
+        <w:t>Straylight waits eighteen world units beyond Neptune on the Sun-to-Neptune line, outside normal Neptune and Triton encounters. It remains absent from rendering, navigation, docking, and encounters until discovery. Its visible hull is at least twenty player-ship lengths; the reveal frames it across most of the scene. The operational artwork is dim before activation; damaged art is reserved for later Ark damage.</w:t>
+      </w:r>
+    </w:p>
+    <w:p>
+      <w:pPr/>
+      <w:r>
+        <w:t>Physical delivery of the final Triton artifact immediately saves discovery and sets the Straylight waypoint. Leaving Triton plays a twelve-second reveal: the HUD recedes, the camera passes Neptune, an enormous silhouette resolves, and the docking corridor illuminates. The existing unidentified-AI transmission follows, then the player flies the approach. Choosing Dock plays a ten-second hull and bay approach and ends at a docked tableau.</w:t>
+      </w:r>
+    </w:p>
+    <w:p>
+      <w:pPr/>
+      <w:r>
+        <w:t>The objects are beacons left by Straylight's crew. Their power sources restart the ship and allow it to charge itself again. An explicit retrieval mission sends the player to Earth. One action collects stored beacons regardless of ore capacity; a six-beacon checklist retains ship, Earth Storage, wreck, and installed ownership. Missing wreck beacons require actual recovery. Partial installation is allowed at Straylight.</w:t>
+      </w:r>
+    </w:p>
+    <w:p>
+      <w:pPr/>
+      <w:r>
+        <w:t>Six installed beacons enable Bring Straylight online. A confirmation warns that activation ends solar exploration and commits to evacuation and departure; Not yet keeps exploration available. Confirmation saves the point of no return, makes the Ark home, and plays a fifteen-second awakening. The Sun is dying: the player must get as many people out of the system as possible. Explicit actions coordinate evacuation, complete a ten-second shuttle-boarding montage, secure the Ark, and begin a twelve-second departure to Aaru Vale. Arrival is a safe Ark-docked state with an acknowledgement. No passenger counts, casualty outcomes, hidden countdown, or rescue-management mechanics are introduced.</w:t>
+      </w:r>
+    </w:p>
+    <w:p>
+      <w:pPr/>
+      <w:r>
+        <w:t>Cinematic takeover freezes gameplay hazards, fuel, oxygen, and flight input. Skip completes only the current animation, never dialogue acceptance or departure authorization. Saved stage boundaries resume unfinished beats without duplicating beacon transfers or replaying completed stages. Native and web use the same sequence, controls, and rendered composition.</w:t>
       </w:r>
     </w:p>
     <w:tbl>
@@ -9930,7 +9972,7 @@
           </w:tcPr>
           <w:p>
             <w:r>
-              <w:t>Visible gas giant landmark; Triton carries the final artifact and battery, and its claim reveals Straylight.</w:t>
+              <w:t>Visible gas giant landmark; ship delivery of Triton's final artifact reveals Straylight.</w:t>
             </w:r>
           </w:p>
         </w:tc>
@@ -10333,11 +10375,16 @@
       </w:r>
     </w:p>
     <w:p>
+      <w:pPr/>
+      <w:r>
+        <w:t>Solar artifact sites have small environmental encounters built into their persistent terrain. Moon retains its EVA crevice and Io its four-segment thermal seal. Mars offers a hard-rock shortcut through a bedrock shelf; Titan a cryo belt with an outer bypass; Titania staggered bedrock faults; and Triton a cryo crossing and lower ledge. Optional Mercury uses separated thermal pockets, while Venus places toxic pockets beside a safe central route. Routes allow recovery without advanced Hazard marks; Mk I treats Thermal and Cryo, while Mk II offers an optional Toxic shortcut. Encounter terrain is generated once with the artifact and retains excavation across visits and reloads. Broader cave-layout variation and oxygen retuning remain separate work.</w:t>
+      </w:r>
+    </w:p>
+    <w:p>
       <w:pPr>
         <w:pStyle w:val="Heading2"/>
       </w:pPr>
       <w:r>
-        <w:lastRenderedPageBreak/>
         <w:t>Asset Inventory And Pipeline</w:t>
       </w:r>
     </w:p>
@@ -11170,7 +11217,6 @@
         <w:pStyle w:val="ListBullet"/>
       </w:pPr>
       <w:r>
-        <w:lastRenderedPageBreak/>
         <w:t>Lunar discovery. Delivering 20 Common Ore, including drone deliveries, queues Mission Control: use the surface scanner. The player acknowledges and performs the pulse. When it reveals the anomaly, the pulse animation completes before a second transmission explains EVA exit, hand-drilling the seal, tethering and physical return to the parked ship. An operator already in EVA receives appropriate instructions. Orbital Pulse Survey is separate. Already revealed undelivered anomalies receive recovery instructions directly; delivered anomalies receive neither lesson.</w:t>
       </w:r>
     </w:p>
@@ -11266,7 +11312,6 @@
       </w:pPr>
       <w:bookmarkStart w:id="6" w:name="GDDSection7"/>
       <w:r>
-        <w:lastRenderedPageBreak/>
         <w:t>7 Technical Architecture And QA</w:t>
       </w:r>
       <w:bookmarkEnd w:id="6"/>
@@ -12350,7 +12395,6 @@
       </w:pPr>
       <w:bookmarkStart w:id="7" w:name="GDDSection8"/>
       <w:r>
-        <w:lastRenderedPageBreak/>
         <w:t>8 Story and Progression Decisions</w:t>
       </w:r>
       <w:bookmarkEnd w:id="7"/>
@@ -12901,7 +12945,7 @@
         <w:pStyle w:val="ListBullet"/>
       </w:pPr>
       <w:r>
-        <w:t>S3 Solar artifact progression is canonical. Main missions run Moon, Mars, Io, Titan, Titania, and Triton. Mercury and Venus are optional after the Moon. Every landing world has one physical artifact; the six main artifacts carry the six batteries. Recovery, claims, route discovery, Earth recommendations, player-selected waypoints, Earth Storage, wreck ownership, and two/four-battery research are independent saved state. Only the Triton claim reveals Straylight. Players may return to Earth, continue onward, revisit worlds, or complete optional recoveries whenever their routes are available.</w:t>
+        <w:t>S3 Solar artifact progression is canonical. Main missions run Moon, Mars, Io, Titan, Titania, and Triton. Mercury and Venus are optional after the Moon. Every landing world has one physical artifact; the six main artifacts carry the six batteries. Recovery, claims, route discovery, Earth recommendations, player-selected waypoints, Earth Storage, wreck ownership, and two/four-battery research are independent saved state. Physical ship delivery of the Triton artifact reveals Straylight immediately and overrides the current waypoint. Before Ark activation, the player may still explore manually. Players may return to Earth, continue onward, revisit worlds, or complete optional recoveries whenever their routes are available.</w:t>
       </w:r>
     </w:p>
     <w:p>
@@ -12909,7 +12953,7 @@
         <w:pStyle w:val="ListBullet"/>
       </w:pPr>
       <w:r>
-        <w:t>TBD S4 Ark and endgame integration. After the Triton claim, Straylight is a reachable derelict dock without service or activation in the solar progression scope. Battery installation, Ark activation, changing the service home, friendly Aaru Vale, Arkfall, hostile Khepri Prime, Rift Belt, Ouroboros, Ascent, and the concrete New Earth objective remain later work.</w:t>
+        <w:t>TBD S4 Later Ark and endgame integration. The Straylight contact, beacon retrieval, awakening, staged evacuation, and departure now reach a safe generated Aaru Vale arrival tableau. Further Aaru Vale objectives, Arkfall, hostile Khepri Prime, Rift Belt, Ouroboros, Ascent, and the concrete New Earth objective remain later work.</w:t>
       </w:r>
     </w:p>
     <w:p>

</xml_diff>

<commit_message>
Unify rig flight controls and let unsupported ships fall
</commit_message>
<xml_diff>
--- a/docs/Rocket_Rogue_Game_Design_Document.docx
+++ b/docs/Rocket_Rogue_Game_Design_Document.docx
@@ -5473,7 +5473,7 @@
     </w:p>
     <w:p>
       <w:r>
-        <w:t>In mining, WASD/arrows or the left stick move the controlled actor. Space uses the Rig drill preference; mouse/controller drill inputs are held. In EVA, mouse or right stick aims independently, left click or RT fires, right click or LT drills, E or controller West scans, T or North toggles tether, and F exits or enters immediately. Holding controller South for 0.6 seconds switches actors; a shorter release performs the contextual ship action. R performs that ship action on keyboard. Pause, modals, focus loss, disconnect, and source switching clear held gameplay inputs.</w:t>
+        <w:t>The mining Rig shares flight steering: A/D or Left/Right rotate, and W/S or Up/Down apply forward/reverse thrust. Hold either Shift to face the mouse and strafe with A/D; release Shift to restore keyboard rotation. On controller, left stick up/down thrusts and reverses, left/right strafes relative to the Rig, and right-stick horizontal input rotates proportionally. Right-stick vertical input does not steer the Rig. Mouse-facing uses the rendered Rig center with a 12-pixel dead zone; UI, actor switches and cinematic takeovers require a fresh Shift press. Rotation retains damped hull motion and terrain collision checks. EVA keeps WASD/arrows or left-stick movement. Space uses the Rig drill preference; mouse/controller drill inputs are held. In EVA, mouse or right stick aims independently, left click or RT fires, right click or LT drills, E or controller West scans, T or North toggles tether, and F exits or enters immediately. Holding controller South for 0.6 seconds switches actors; a shorter release performs the contextual ship action. R performs that ship action on keyboard. Pause, modals, focus loss, disconnect, and source switching clear held gameplay inputs.</w:t>
       </w:r>
     </w:p>
     <w:tbl>
@@ -6130,7 +6130,7 @@
     </w:p>
     <w:p>
       <w:r>
-        <w:t>Ship services and return guidance use the parked ship position and layer, including underground landings. Within its service field, a docked Rig refills Rig oxygen, an EVA operator refills Suit oxygen, and an occupied docked Rig refills both. Oxygen service never creates fuel. Departure requires the controlled actor in the ship service zone: the Rig in Rig mode or the operator in EVA. The operator may leave without a functioning Rig; cargo and drones left behind are not teleported or credited. Terrain and unopened seam lips remain physical barriers to return travel.</w:t>
+        <w:t>Ship services and return guidance use the parked ship position and layer, including underground landings. Removing the terrain beneath the parked ship lets it fall under landing gravity. Its upright hull sweeps the full landing width and settles on the next supporting surface, including across cached depth layers. Ship services, return guidance and departure follow its physical location; the original surface reference remains fixed. Saves retain its position and falling velocity. Within its service field, a docked Rig refills Rig oxygen, an EVA operator refills Suit oxygen, and an occupied docked Rig refills both. Oxygen service never creates fuel. Departure requires the controlled actor in the ship service zone: the Rig in Rig mode or the operator in EVA. The operator may leave without a functioning Rig; cargo and drones left behind are not teleported or credited. Terrain and unopened seam lips remain physical barriers to return travel.</w:t>
       </w:r>
     </w:p>
     <w:p>

</xml_diff>

<commit_message>
Refine demo UI and app services
</commit_message>
<xml_diff>
--- a/docs/Rocket_Rogue_Game_Design_Document.docx
+++ b/docs/Rocket_Rogue_Game_Design_Document.docx
@@ -4171,7 +4171,7 @@
     </w:p>
     <w:p>
       <w:r>
-        <w:t>One physical Flight simulation owns Travel, Orbit and Landing. The opening Launch action presents the saved Mission Control transmission before releasing the departure impulse. A/D (or Left/Right) rotate; W/S (or Up/Down) apply forward/reverse thrust. Hold either Shift to face the mouse and make A/D strafe relative to the ship; release Shift to restore keyboard rotation. Q/E have no flight binding. On controller, right-stick horizontal input rotates proportionally; the left stick controls lateral and forward/reverse thrust. Bumpers and right-stick vertical input do not steer flight. Mouse-facing uses the rendered ship pose through orbit, landing and ascent, with the normal turning limits and a 12-pixel cursor dead zone. UI and cinematic takeovers suspend steering and require a fresh Shift press afterward. Reverse thrust is not automatic braking. Lateral thrusters provide half the main engine acceleration, consume propulsion fuel and generate heat, and cancel cruise when used. Keyboard forward/reverse thrust ramps over 0.40 seconds and release cuts immediately; analog input is proportional. Coasting spends no propulsion fuel. Powered heat accumulation is reduced for forgiving correction burns; the first Moon mission also receives four times the normal thermal failure grace. Position, velocity, fuel, heat and hull remain authoritative.</w:t>
+        <w:t>One physical Flight simulation owns Travel, Orbit and Landing. The opening Launch action presents the saved Mission Control transmission before releasing the departure impulse. A/D (or Left/Right) rotate; W/S (or Up/Down) apply forward/reverse thrust. Hold either Shift to make A/D strafe relative to the ship without mouse steering; release Shift to restore keyboard rotation. Q/E have no flight binding. On controller, right-stick horizontal input rotates proportionally; the left stick controls lateral and forward/reverse thrust. Bumpers and right-stick vertical input do not steer flight. Moving the mouse does not change the ship heading. UI and cinematic takeovers suspend gameplay input. Reverse thrust is not automatic braking. Lateral thrusters provide half the main engine acceleration, consume propulsion fuel and generate heat, and cancel cruise when used. Keyboard forward/reverse thrust ramps over 0.40 seconds and release cuts immediately; analog input is proportional. Coasting spends no propulsion fuel. Powered heat accumulation is reduced for forgiving correction burns; the first Moon mission also receives four times the normal thermal failure grace. Position, velocity, fuel, heat and hull remain authoritative.</w:t>
       </w:r>
     </w:p>
     <w:tbl>
@@ -5473,7 +5473,7 @@
     </w:p>
     <w:p>
       <w:r>
-        <w:t>The mining Rig shares flight steering: A/D or Left/Right rotate, and W/S or Up/Down apply forward/reverse thrust. Hold either Shift to face the mouse and strafe with A/D; release Shift to restore keyboard rotation. On controller, left stick up/down thrusts and reverses, left/right strafes relative to the Rig, and right-stick horizontal input rotates proportionally. Right-stick vertical input does not steer the Rig. Mouse-facing uses the rendered Rig center with a 12-pixel dead zone; UI, actor switches and cinematic takeovers require a fresh Shift press. Rotation retains damped hull motion and terrain collision checks. EVA keeps WASD/arrows or left-stick movement. Space uses the Rig drill preference; mouse/controller drill inputs are held. In EVA, mouse or right stick aims independently, left click or RT fires, right click or LT drills, E or controller West scans, T or North toggles tether, and F exits or enters immediately. Holding controller South for 0.6 seconds switches actors; a shorter release performs the contextual ship action. R performs that ship action on keyboard. Pause, modals, focus loss, disconnect, and source switching clear held gameplay inputs.</w:t>
+        <w:t>The mining Rig shares flight steering: A/D or Left/Right rotate, and W/S or Up/Down apply forward/reverse thrust. Hold either Shift to strafe with A/D without mouse steering; release Shift to restore keyboard rotation. On controller, the left stick moves in screen directions regardless of drill heading, and right-stick horizontal input rotates proportionally. Right-stick vertical input does not steer the Rig. Moving the mouse does not change the Rig heading. Rotation retains damped hull motion and terrain collision checks. EVA keeps WASD/arrows or left-stick movement. Space uses the Rig drill preference; mouse/controller drill inputs are held. In EVA, mouse or right stick aims independently, left click or RT fires, right click or LT drills, E or controller West scans, T or North toggles tether, and F exits or enters immediately. Holding controller South for 0.6 seconds switches actors; a shorter release performs the contextual ship action. R performs that ship action on keyboard. Pause, modals, focus loss, disconnect, and source switching clear held gameplay inputs.</w:t>
       </w:r>
     </w:p>
     <w:tbl>

</xml_diff>

<commit_message>
Add mission guidance and mining flight UI
</commit_message>
<xml_diff>
--- a/docs/Rocket_Rogue_Game_Design_Document.docx
+++ b/docs/Rocket_Rogue_Game_Design_Document.docx
@@ -4159,6 +4159,38 @@
       <w:pPr/>
       <w:r>
         <w:t>C or controller left-stick click toggles cruise. Cruise uses ordinary steering and forward thrust toward the selected body center, with no braking, avoidance, capture assistance, fuel advantage, or destination protection. Manual steering or thrust cancels it immediately. Map inspection pauses simulation and visibly identifies cruise that will resume on closing. Earth docking requires rendezvous with its orbital marker within 2 system units at no more than 1.0 relative speed and an explicit Dock action; choosing Earth on the map does not dock or service the ship. Plot course immediately exposes target guidance and a brief manual-flight or active-cruise notice. At home, Depart dock enters a ready view; the dock holds the ship until forward or lateral thrust releases it and applies ordinary thrust in the same step. No velocity grant or protection persists after undocking. The Earth service dock is 1.962 units toward the Moon from Earth center, outside every local gravity region including its full docking range. Dock offsets belong to system content. Explicitly attached Earth dock saves follow the current marker, preserving resources and heading; free-flight and surface positions remain unchanged.</w:t>
+      </w:r>
+    </w:p>
+    <w:p>
+      <w:pPr>
+        <w:pStyle w:val="Heading2"/>
+      </w:pPr>
+      <w:r>
+        <w:t>Mission guidance</w:t>
+      </w:r>
+    </w:p>
+    <w:p>
+      <w:pPr/>
+      <w:r>
+        <w:t>One persistent tracker below the upper-left HUD names the tracked mission and location, gives one actionable next step, and shows at most two progress indicators. It remains visible during travel, orbit, landing, mining and docking, but yields to full-screen messages and cinematics. Actual step changes briefly highlight the tracker; repeated reminders and automatic mission rotation are avoided. Survival warnings retain priority.</w:t>
+      </w:r>
+    </w:p>
+    <w:p>
+      <w:pPr/>
+      <w:r>
+        <w:t>The first Moon orbital scan uses the existing paused scan result to explain the whole assignment: land in the labeled mission sector, deliver 20 Common Ore to the ship, pulse the surface scanner, then recover and bring the artifact aboard. A labeled MISSION LANDING SITE outline identifies the real sector without disclosing underground depth. In that sector the primary action is Land at mission site; elsewhere it is Resume flight to mission sector, with landing elsewhere available. Preparing a shaft is optional. Landing eligibility and the release-before-next-action input fence still apply.</w:t>
+      </w:r>
+    </w:p>
+    <w:p>
+      <w:pPr/>
+      <w:r>
+        <w:t>Missions sits alongside Map and opens from the tracker. Discovered campaign missions and available optional objectives show purpose, destination, ordered requirements, completion states and existing rewards. Completed entries are collapsed. Track mission selects one objective without engaging cruise; a manual exploration waypoint remains until Return to mission explicitly restores guidance. Campaign tracking advances at the existing claim boundary. Straylight discovery, activation, evacuation and departure retain their explicit actions and priority.</w:t>
+      </w:r>
+    </w:p>
+    <w:p>
+      <w:pPr/>
+      <w:r>
+        <w:t>Mission presentation is derived from existing scenario counters, surveys and physical artifact ownership. Ore counts advance on delivery, not excavation or rig cargo. Exposed and tethered artifacts remain incomplete; aboard ship, banked, wreck recovery and ready-to-claim states stay distinct. A missing artifact points to its named wreck. Saved tracking and first-scan introduction state survive reload; an interrupted introduction resumes, completed explanations stay in the log, and established legacy campaigns skip the opening explanation.</w:t>
       </w:r>
     </w:p>
     <w:p>
@@ -5473,7 +5505,7 @@
     </w:p>
     <w:p>
       <w:r>
-        <w:t>The mining Rig shares flight steering: A/D or Left/Right rotate, and W/S or Up/Down apply forward/reverse thrust. Hold either Shift to strafe with A/D without mouse steering; release Shift to restore keyboard rotation. On controller, the left stick moves in screen directions regardless of drill heading, and right-stick horizontal input rotates proportionally. Right-stick vertical input does not steer the Rig. Moving the mouse does not change the Rig heading. Rotation retains damped hull motion and terrain collision checks. EVA keeps WASD/arrows or left-stick movement. Space uses the Rig drill preference; mouse/controller drill inputs are held. In EVA, mouse or right stick aims independently, left click or RT fires, right click or LT drills, E or controller West scans, T or North toggles tether, and F exits or enters immediately. Holding controller South for 0.6 seconds switches actors; a shorter release performs the contextual ship action. R performs that ship action on keyboard. Pause, modals, focus loss, disconnect, and source switching clear held gameplay inputs.</w:t>
+        <w:t>The mining Rig turns toward the mouse without holding Shift. WASD or arrows move in screen directions regardless of drill heading: W/Up moves up, S/Down moves down, and A/D or Left/Right move sideways. Shift does not change mining controls. On controller, the left stick moves in screen directions regardless of drill heading. The right stick points the drill in any screen direction, including diagonals; centering it holds the current heading. Turning follows the shortest angular path, with exactly opposite targets turning clockwise. Stick deflection does not scale turning speed; the existing controller deadzone applies. Mouse aiming uses the rendered Rig center and a small dead zone. UI hover and gameplay interruptions suspend mouse aiming. Rotation retains damped hull motion and terrain collision checks. EVA keeps WASD/arrows or left-stick movement. Space uses the Rig drill preference; mouse/controller drill inputs are held. In EVA, mouse or right stick aims independently, left click or RT fires, right click or LT drills, E or controller West scans, T or North toggles tether, and F exits or enters immediately. Holding controller South for 0.6 seconds switches actors; a shorter release performs the contextual ship action. R performs that ship action on keyboard. Pause, modals, focus loss, disconnect, and source switching clear held gameplay inputs.</w:t>
       </w:r>
     </w:p>
     <w:tbl>
@@ -12929,7 +12961,7 @@
         <w:pStyle w:val="ListBullet"/>
       </w:pPr>
       <w:r>
-        <w:t>TBD S1 Further teaching and pacing. The implemented opening uses a one-second fade, Launch-triggered instruction, cause-aware crash retries and contextual messages for dock approach, hard landings, full cargo, lunar discovery and the first Prospector. Every solar mission has concise pre-mission objectives, an in-mission checklist, and one post-claim completion message. Further playtesting should refine timing and clarity without adding redundant text.</w:t>
+        <w:t>TBD S1 Further teaching and pacing. The implemented opening uses a one-second fade, Launch-triggered instruction, cause-aware crash retries and contextual messages for dock approach, hard landings, full cargo, lunar discovery and the first Prospector. The first scan names the mission sector and explains ore-before-artifact recovery; the persistent tracker and Missions log share authoritative progress. Further first-time-player observation should refine clarity without adding redundant text.</w:t>
       </w:r>
     </w:p>
     <w:p>

</xml_diff>

<commit_message>
Polish campaign guidance, mining, and Sun art
</commit_message>
<xml_diff>
--- a/docs/Rocket_Rogue_Game_Design_Document.docx
+++ b/docs/Rocket_Rogue_Game_Design_Document.docx
@@ -4143,10 +4143,7 @@
     <w:p>
       <w:pPr/>
       <w:r>
-        <w:t>Every solar body is approachable in a compressed, authored system with stationary body transforms. Actual ship position determines body encounters, including unselected bodies. System and body frames preserve position and velocity; changing the navigation target changes guidance only. Earth is the initial service home. A planetary visit, completed mission, packing sequence, or ascent does not end the expedition or refill the ship.</w:t>
-      </w:r>
-      <w:r>
-        <w:t xml:space="preserve"> Each body applies capped inverse-square gravity inside its authored influence radius, then smoothly fades to zero by 1.1 times that radius. Bodies beyond this boundary exert no pull; live flight and forecasts share the same calculation. Local landing gravity remains separate.</w:t>
+        <w:t>Every solar body is approachable in a compressed, authored system with stationary body transforms. Actual ship position determines body encounters, including unselected bodies. System and body frames preserve position and velocity; changing the navigation target changes guidance only. Earth is the initial service home. A planetary visit, completed mission, packing sequence, or ascent does not end the expedition or refill the ship. Each body applies capped inverse-square gravity inside its authored influence radius, then smoothly fades to zero by 1.1 times that radius. Bodies beyond this boundary exert no pull; live flight and forecasts share the same calculation. Local landing gravity remains separate. The asteroid belt retains at least 8U of collision-free clearance beyond every planet and moon influence radius, including both ship and asteroid collision radii, in every travel direction. Conflicting rocks are filtered without moving the remaining rocks or changing belt bounds. Inward/outward warnings, swept collision and manual braking remain.</w:t>
       </w:r>
     </w:p>
     <w:p>
@@ -4184,7 +4181,7 @@
     <w:p>
       <w:pPr/>
       <w:r>
-        <w:t>Missions sits alongside Map and opens from the tracker. Discovered campaign missions and available optional objectives show purpose, destination, ordered requirements, completion states and existing rewards. Completed entries are collapsed. Track mission selects one objective without engaging cruise; a manual exploration waypoint remains until Return to mission explicitly restores guidance. Campaign tracking advances at the existing claim boundary. Straylight discovery, activation, evacuation and departure retain their explicit actions and priority.</w:t>
+        <w:t>Missions sits alongside Map and opens from the tracker. Shared mission guidance resolves the actual artifact custody: aboard or banked awaiting claim targets its required Earth or Straylight dock; wreck custody targets the named artifact wreck; claiming or accepting the next assignment selects its destination. Capture, departure, loss, respawn, salvage, banking, claim and reload reconcile this guidance in the current system. Explicit exploration waypoints survive routine handoffs, including crashes and arrival, until Return to mission, Track mission, or target invalidation. Automatic targeting never engages cruise. Story navigation and confirmations remain explicit. Player-facing landing areas are called Sector; saved zone identifiers do not change.</w:t>
       </w:r>
     </w:p>
     <w:p>
@@ -4660,7 +4657,7 @@
     </w:p>
     <w:p>
       <w:r>
-        <w:t>After surveying, hold DRILL to excavate the selected site and release to stop. The laser has no heat or cooldown mechanic. Reach is limited by both Survey Array and Bore ratings. The red beam appears only during drilling; the completed shaft stays green for contrast. Protected support, gates, suit-only passages and supply objects remain protected. Resume Flight, Escape/controller East or steering/thrust exits inspection. Save the previous sector before switching and restore its own progress on return. Guidance reads ORBIT HERE before capture, SCAN HERE after capture, then DRILL HERE or LAND HERE at the surface; surface labels sit beside the approach lane.</w:t>
+        <w:t>After surveying, hold DRILL to excavate the selected site and release to stop. The laser has no heat or cooldown mechanic. Reach is limited by both Survey Array and Bore ratings. Shaft selection avoids artifacts and authored objective structures. Once selected, every ordinary terrain tile in its path is destroyed, including bedrock and fuel/oxygen pockets; ore chunks retain their drops, while supply pockets and bedrock provide no rewards. After the Moon tutorial, campaign-sector shafts stop at a rig-sized entrance near the top of the artifact layer, even with higher Bore ranks. Intervening layers remain accessible. A fresh site retains a deliberate mineable approach to the protected objective perimeter; existing excavation is never refilled. The corrected introductory Moon shaft is unchanged. Resume Flight, Escape/controller East or steering/thrust exits inspection; sector progress persists independently.</w:t>
       </w:r>
     </w:p>
     <w:p>
@@ -4699,9 +4696,8 @@
     </w:p>
     <w:p>
       <w:r>
-        <w:t>The opening camera frames Earth below-left and Moon above-right while keeping the ship readable. Body framing changes gradually by actual distance on approach and departure; coordinate-frame ownership never chooses an abrupt zoom or simulation clock. Near bodies, world time is slowed with full player controls and eases into travel timing. The compact top HUD blends in during terrain-backed descent over 0.6 seconds and reserves the XP row before deployment. A shared surface transform uses square terrain cells, uniform artwork scale and a touchdown contact near 28 percent of the usable viewport, with at least 24 pixels of ship clearance below the HUD. Airborne framing includes the full ship and approaching ground. Touchdown and bay opening retain the same scale and terrain anchors; smooth Rig following begins after control handoff. Nearby bedrock extends beyond the playable edges to fill the view.</w:t>
+        <w:t>The opening camera frames Earth below-left and Moon above-right while keeping the ship readable. Body framing changes gradually by actual distance on approach and departure; coordinate-frame ownership never chooses an abrupt zoom or simulation clock. Near bodies, world time is slowed with full player controls and eases into travel timing. The compact top HUD blends in during terrain-backed descent over 0.6 seconds and reserves the XP row before deployment. A shared surface transform uses square terrain cells, uniform artwork scale and a touchdown contact near 28 percent of the usable viewport, with at least 24 pixels of ship clearance below the HUD. Airborne framing includes the full ship and approaching ground. Touchdown and bay opening retain the same scale and terrain anchors; smooth Rig following begins after control handoff. Nearby bedrock extends beyond the playable edges to fill the view. Initial landing descent and boarded ship flight share the local close-up safeguard: floor interest is limited to six cells horizontally and eight cells below the ship. Distant or missing shaft floors cannot zoom out to fit the full excavation; ship, terrain, markers and pointer coordinates use the same surface transform.</w:t>
       </w:r>
-      <w:r/>
     </w:p>
     <w:p>
       <w:pPr>
@@ -4726,7 +4722,7 @@
     </w:p>
     <w:p>
       <w:r>
-        <w:t>Packing at the parked ship settles carried payload once and preserves excavation. Ignition begins upright local ascent with thrust already engaged. Departure assistance regulates climb toward 8 m/s until the player takes throttle control or local ascent ends. Crossing 46 m above the surface origin at at least 2 m/s upward exits to orbit. The support latch permits liftoff without immediately relanding; subsequent contacts retain normal collision damage. Local ascent has no heat damage. The orbital handoff ends automatic thrust, preserves converted momentum and eases camera and world timing toward travel.</w:t>
+        <w:t>Packing at the parked ship settles carried payload once and preserves excavation. Ignition begins upright local ascent with thrust engaged. The shared 8 m/s powered-ascent governor applies from underground ignition, including manual keyboard/controller throttle and angled flight. It smoothly reduces excess acceleration rather than snapping velocity, preserving steering, lateral movement, braking and throttle response. Crossing 46 m above the surface origin at at least 2 m/s upward exits to orbit. Held thrust continues through the handoff and normal space acceleration blends back over 1.25 seconds. Sustained outward thrust can still leave orbit; capture remains player-controlled. Underground ship descent, falling-ore collection, parking and takeoff remain available wherever physical clearance permits.</w:t>
       </w:r>
     </w:p>
     <w:p>
@@ -6213,7 +6209,390 @@
     </w:p>
     <w:p>
       <w:r>
-        <w:t>The operational home shipyard offers deterministic next-rank installation for Fuel Tanks, Flight Controls, Engine Cooling, Hull Plating, Survey Array, and Bore. Rank I is available at Earth from the start without lesson completion or random offers. Each card shows benefit, existing credit price, and a direct Install action. Fuel Tanks increase ship capacity; Flight Controls add 10 percent physical thrust per rank at the same burn rate; Cooling governs powered heat and coast cooling; Hull increases integrity. Survey and Bore retain their independent reach. Rank II requires two distinct batteries ever banked at Earth or installed at Straylight; rank III requires four. Existing installed ranks remain effective. Battery research acquisition and field ship supplies are TBD S2/S3.</w:t>
+        <w:t>The operational home shipyard offers deterministic next-rank installation for Fuel Tanks, Flight Controls, Engine Cooling, Hull Plating, Survey Array, and Bore. Rank I is available at Earth from the start without lesson completion or random offers. Each card shows benefit, existing credit price, and a direct Install action. Fuel Tanks increase ship capacity; Flight Controls add 10 percent physical thrust per rank at the same burn rate; Cooling governs powered heat and coast cooling; Hull increases integrity. Survey and Bore retain their independent reach. Rank II requires two distinct batteries ever banked at Earth or installed at Straylight; rank III requires four. Existing installed ranks remain effective. Battery research acquisition and field ship supplies are TBD S2/S3. Permanent prices use fixed rank bands across saves: Fuel Tanks, Flight Controls, Engine Cooling, Hull and Rig Fuel Loop cost 35 / 105 / 210 credits for ranks I / II / III; Survey Array and Bore each cost 40 / 90 / 115. Purchases and balances persist unchanged. Normal successful missions budget the next required depth pair plus roughly one optional upgrade; perfect flight and optional exploration supply surplus. Arrival rewards use a saved per-body receipt; scanning, revisiting, banking and reloading do not duplicate them. No ore-selling or mandatory grinding is introduced.</w:t>
+      </w:r>
+    </w:p>
+    <w:tbl>
+      <w:tblPr>
+        <w:tblStyle w:val="TableGrid"/>
+        <w:tblW w:type="auto" w:w="0"/>
+        <w:tblLook w:firstColumn="1" w:firstRow="1" w:lastColumn="0" w:lastRow="0" w:noHBand="0" w:noVBand="1" w:val="04A0"/>
+      </w:tblPr>
+      <w:tblGrid>
+        <w:gridCol w:w="1872"/>
+        <w:gridCol w:w="1872"/>
+        <w:gridCol w:w="1872"/>
+        <w:gridCol w:w="1872"/>
+        <w:gridCol w:w="1872"/>
+      </w:tblGrid>
+      <w:tr>
+        <w:tc>
+          <w:tcPr>
+            <w:tcW w:type="dxa" w:w="1872"/>
+          </w:tcPr>
+          <w:p>
+            <w:r>
+              <w:t>Mission</w:t>
+            </w:r>
+          </w:p>
+        </w:tc>
+        <w:tc>
+          <w:tcPr>
+            <w:tcW w:type="dxa" w:w="1872"/>
+          </w:tcPr>
+          <w:p>
+            <w:r>
+              <w:t>Orbit</w:t>
+            </w:r>
+          </w:p>
+        </w:tc>
+        <w:tc>
+          <w:tcPr>
+            <w:tcW w:type="dxa" w:w="1872"/>
+          </w:tcPr>
+          <w:p>
+            <w:r>
+              <w:t>Carried then banked</w:t>
+            </w:r>
+          </w:p>
+        </w:tc>
+        <w:tc>
+          <w:tcPr>
+            <w:tcW w:type="dxa" w:w="1872"/>
+          </w:tcPr>
+          <w:p>
+            <w:r>
+              <w:t>Purchases</w:t>
+            </w:r>
+          </w:p>
+        </w:tc>
+        <w:tc>
+          <w:tcPr>
+            <w:tcW w:type="dxa" w:w="1872"/>
+          </w:tcPr>
+          <w:p>
+            <w:r>
+              <w:t>Balance</w:t>
+            </w:r>
+          </w:p>
+        </w:tc>
+      </w:tr>
+      <w:tr>
+        <w:tc>
+          <w:tcPr>
+            <w:tcW w:type="dxa" w:w="1872"/>
+          </w:tcPr>
+          <w:p>
+            <w:r>
+              <w:t>Moon</w:t>
+            </w:r>
+          </w:p>
+        </w:tc>
+        <w:tc>
+          <w:tcPr>
+            <w:tcW w:type="dxa" w:w="1872"/>
+          </w:tcPr>
+          <w:p>
+            <w:r>
+              <w:t>18.00</w:t>
+            </w:r>
+          </w:p>
+        </w:tc>
+        <w:tc>
+          <w:tcPr>
+            <w:tcW w:type="dxa" w:w="1872"/>
+          </w:tcPr>
+          <w:p>
+            <w:r>
+              <w:t>56.55</w:t>
+            </w:r>
+          </w:p>
+        </w:tc>
+        <w:tc>
+          <w:tcPr>
+            <w:tcW w:type="dxa" w:w="1872"/>
+          </w:tcPr>
+          <w:p>
+            <w:r>
+              <w:t>Flight I 35</w:t>
+            </w:r>
+          </w:p>
+        </w:tc>
+        <w:tc>
+          <w:tcPr>
+            <w:tcW w:type="dxa" w:w="1872"/>
+          </w:tcPr>
+          <w:p>
+            <w:r>
+              <w:t>39.55</w:t>
+            </w:r>
+          </w:p>
+        </w:tc>
+      </w:tr>
+      <w:tr>
+        <w:tc>
+          <w:tcPr>
+            <w:tcW w:type="dxa" w:w="1872"/>
+          </w:tcPr>
+          <w:p>
+            <w:r>
+              <w:t>Mars</w:t>
+            </w:r>
+          </w:p>
+        </w:tc>
+        <w:tc>
+          <w:tcPr>
+            <w:tcW w:type="dxa" w:w="1872"/>
+          </w:tcPr>
+          <w:p>
+            <w:r>
+              <w:t>18.70</w:t>
+            </w:r>
+          </w:p>
+        </w:tc>
+        <w:tc>
+          <w:tcPr>
+            <w:tcW w:type="dxa" w:w="1872"/>
+          </w:tcPr>
+          <w:p>
+            <w:r>
+              <w:t>130.65</w:t>
+            </w:r>
+          </w:p>
+        </w:tc>
+        <w:tc>
+          <w:tcPr>
+            <w:tcW w:type="dxa" w:w="1872"/>
+          </w:tcPr>
+          <w:p>
+            <w:r>
+              <w:t>Survey I + Bore I 80; Flight II 105</w:t>
+            </w:r>
+          </w:p>
+        </w:tc>
+        <w:tc>
+          <w:tcPr>
+            <w:tcW w:type="dxa" w:w="1872"/>
+          </w:tcPr>
+          <w:p>
+            <w:r>
+              <w:t>3.90</w:t>
+            </w:r>
+          </w:p>
+        </w:tc>
+      </w:tr>
+      <w:tr>
+        <w:tc>
+          <w:tcPr>
+            <w:tcW w:type="dxa" w:w="1872"/>
+          </w:tcPr>
+          <w:p>
+            <w:r>
+              <w:t>Io</w:t>
+            </w:r>
+          </w:p>
+        </w:tc>
+        <w:tc>
+          <w:tcPr>
+            <w:tcW w:type="dxa" w:w="1872"/>
+          </w:tcPr>
+          <w:p>
+            <w:r>
+              <w:t>24.20</w:t>
+            </w:r>
+          </w:p>
+        </w:tc>
+        <w:tc>
+          <w:tcPr>
+            <w:tcW w:type="dxa" w:w="1872"/>
+          </w:tcPr>
+          <w:p>
+            <w:r>
+              <w:t>200.97</w:t>
+            </w:r>
+          </w:p>
+        </w:tc>
+        <w:tc>
+          <w:tcPr>
+            <w:tcW w:type="dxa" w:w="1872"/>
+          </w:tcPr>
+          <w:p>
+            <w:r>
+              <w:t>Survey II + Bore II 180; Hull I 35</w:t>
+            </w:r>
+          </w:p>
+        </w:tc>
+        <w:tc>
+          <w:tcPr>
+            <w:tcW w:type="dxa" w:w="1872"/>
+          </w:tcPr>
+          <w:p>
+            <w:r>
+              <w:t>14.07</w:t>
+            </w:r>
+          </w:p>
+        </w:tc>
+      </w:tr>
+      <w:tr>
+        <w:tc>
+          <w:tcPr>
+            <w:tcW w:type="dxa" w:w="1872"/>
+          </w:tcPr>
+          <w:p>
+            <w:r>
+              <w:t>Titan</w:t>
+            </w:r>
+          </w:p>
+        </w:tc>
+        <w:tc>
+          <w:tcPr>
+            <w:tcW w:type="dxa" w:w="1872"/>
+          </w:tcPr>
+          <w:p>
+            <w:r>
+              <w:t>28.60</w:t>
+            </w:r>
+          </w:p>
+        </w:tc>
+        <w:tc>
+          <w:tcPr>
+            <w:tcW w:type="dxa" w:w="1872"/>
+          </w:tcPr>
+          <w:p>
+            <w:r>
+              <w:t>260.13</w:t>
+            </w:r>
+          </w:p>
+        </w:tc>
+        <w:tc>
+          <w:tcPr>
+            <w:tcW w:type="dxa" w:w="1872"/>
+          </w:tcPr>
+          <w:p>
+            <w:r>
+              <w:t>Survey III + Bore III 230; Cooling I 35</w:t>
+            </w:r>
+          </w:p>
+        </w:tc>
+        <w:tc>
+          <w:tcPr>
+            <w:tcW w:type="dxa" w:w="1872"/>
+          </w:tcPr>
+          <w:p>
+            <w:r>
+              <w:t>37.80</w:t>
+            </w:r>
+          </w:p>
+        </w:tc>
+      </w:tr>
+      <w:tr>
+        <w:tc>
+          <w:tcPr>
+            <w:tcW w:type="dxa" w:w="1872"/>
+          </w:tcPr>
+          <w:p>
+            <w:r>
+              <w:t>Titania</w:t>
+            </w:r>
+          </w:p>
+        </w:tc>
+        <w:tc>
+          <w:tcPr>
+            <w:tcW w:type="dxa" w:w="1872"/>
+          </w:tcPr>
+          <w:p>
+            <w:r>
+              <w:t>34.10</w:t>
+            </w:r>
+          </w:p>
+        </w:tc>
+        <w:tc>
+          <w:tcPr>
+            <w:tcW w:type="dxa" w:w="1872"/>
+          </w:tcPr>
+          <w:p>
+            <w:r>
+              <w:t>341.62</w:t>
+            </w:r>
+          </w:p>
+        </w:tc>
+        <w:tc>
+          <w:tcPr>
+            <w:tcW w:type="dxa" w:w="1872"/>
+          </w:tcPr>
+          <w:p>
+            <w:r>
+              <w:t>Flight III 210</w:t>
+            </w:r>
+          </w:p>
+        </w:tc>
+        <w:tc>
+          <w:tcPr>
+            <w:tcW w:type="dxa" w:w="1872"/>
+          </w:tcPr>
+          <w:p>
+            <w:r>
+              <w:t>203.52</w:t>
+            </w:r>
+          </w:p>
+        </w:tc>
+      </w:tr>
+      <w:tr>
+        <w:tc>
+          <w:tcPr>
+            <w:tcW w:type="dxa" w:w="1872"/>
+          </w:tcPr>
+          <w:p>
+            <w:r>
+              <w:t>Triton</w:t>
+            </w:r>
+          </w:p>
+        </w:tc>
+        <w:tc>
+          <w:tcPr>
+            <w:tcW w:type="dxa" w:w="1872"/>
+          </w:tcPr>
+          <w:p>
+            <w:r>
+              <w:t>41.80</w:t>
+            </w:r>
+          </w:p>
+        </w:tc>
+        <w:tc>
+          <w:tcPr>
+            <w:tcW w:type="dxa" w:w="1872"/>
+          </w:tcPr>
+          <w:p>
+            <w:r>
+              <w:t>462.84</w:t>
+            </w:r>
+          </w:p>
+        </w:tc>
+        <w:tc>
+          <w:tcPr>
+            <w:tcW w:type="dxa" w:w="1872"/>
+          </w:tcPr>
+          <w:p>
+            <w:r>
+              <w:t>Hull II 105</w:t>
+            </w:r>
+          </w:p>
+        </w:tc>
+        <w:tc>
+          <w:tcPr>
+            <w:tcW w:type="dxa" w:w="1872"/>
+          </w:tcPr>
+          <w:p>
+            <w:r>
+              <w:t>603.16</w:t>
+            </w:r>
+          </w:p>
+        </w:tc>
+      </w:tr>
+    </w:tbl>
+    <w:p>
+      <w:r>
+        <w:t>Measured normal campaign budget: zero opening credits, Good orbit grades, first successful landings, no optional exploration or repeat mining. Required ore and artifact claims add no credit sales. Orbit credits are spendable immediately; landing credits travel in ship cargo until banking and are at risk in wrecks. Displayed figures are rounded; internal balances retain precision. This example buys depth capabilities before the next deeper mission; optional purchases can be exchanged within the fixed rank bands.</w:t>
       </w:r>
     </w:p>
     <w:tbl>
@@ -9102,7 +9481,7 @@
     <w:p>
       <w:pPr/>
       <w:r>
-        <w:t>The first later ship loss opens a saved, explicitly acknowledged salvage explanation at the home dock. Artifact-bearing wrecks use a purple diamond and an Artifact / Wreck label in flight and waypoint guidance. After recovering the artifact, any remaining ore wreck returns to its ordinary marker. Nearby salvage controls explain speed matching and full-hold recovery of artifacts and upgrades. Earth Storage remains safe.</w:t>
+        <w:t>The first ship loss opens a saved, explicitly acknowledged salvage explanation at the home dock. If it carries an artifact, one combined recovery briefing explains the named wreck, 2U salvage range, speed matching and return to the required delivery dock. It replaces the overlapping generic salvage notice. Artifact-bearing wrecks use a purple diamond and an Artifact / Wreck label; after artifact recovery, remaining ore uses an ordinary wreck marker. Full ore holds do not prevent artifact or upgrade recovery. Stored artifacts remain safe.</w:t>
       </w:r>
     </w:p>
     <w:p>
@@ -9143,7 +9522,7 @@
         <w:jc w:val="center"/>
       </w:pPr>
       <w:r>
-        <w:t>The solar system includes Earth and its service dock, Mercury, Venus, Moon, Mars, Jupiter and Io, Saturn and Titan, Uranus and Titania, Neptune and Triton, and derelict Straylight. Gas giants are visible orbital landmarks; Io, Titan, Titania, and Triton provide their mining expeditions. A new campaign charts only Sun, Earth, and Moon. Claims reveal the next main system, while Straylight remains absent from rendering, targeting, collision, preview, and messages until Triton's artifact is physically delivered into the player ship. Delivery immediately reveals Straylight and sets its waypoint, before mission claim or Earth banking.</w:t>
+        <w:t>The solar system includes Earth and its service dock, Mercury, Venus, Moon, Mars, Jupiter and Io, Saturn and Titan, Uranus and Titania, Neptune and Triton, and derelict Straylight. Gas giants are visible orbital landmarks; Io, Titan, Titania, and Triton provide their mining expeditions. A new campaign charts only Sun, Earth, and Moon. Claims reveal the next main system, while Straylight remains absent from rendering, targeting, collision, preview, and messages until Triton's artifact is physically delivered into the player ship. Delivery immediately reveals Straylight and sets its waypoint, before mission claim or Earth banking. The Sun uses a shared transparent yellow-orange pixel-art texture with bright surface highlights and corona in flight and Straylight cinematics. Gameplay radius and navigation geometry remain unchanged; generation provenance accompanies the asset.</w:t>
       </w:r>
     </w:p>
     <w:p>
@@ -11241,7 +11620,7 @@
         <w:pStyle w:val="ListBullet"/>
       </w:pPr>
       <w:r>
-        <w:t>Incoming Messages. A reusable transmission card shows a registered character portrait, speaker and channel, title, short message, contextual controls and one explicit acknowledgement. Speaker definitions, message variants, delivery state and presentation remain separate. Mission logic owns eligibility and consumes typed acknowledgements; the card never grants rewards or mutates cargo. The unnamed Mission Control fennec operator has oversized natural ears and is distinct from Vela Fox.</w:t>
+        <w:t>Incoming Messages use a transmission card with portrait, speaker, channel, title, concise text and explicit acknowledgement. Mission logic owns eligibility; the card does not grant rewards or mutate cargo. Fennec retains essential first-time instructions, character dialogue, mission acceptance and story decisions. Independent informational messages are separated by eight seconds of active gameplay and deferred during drilling, combat, local landing/ascent and docking. Stale cargo/fuel tips retire when their condition clears. Drone unlock information is consolidated into associated briefings where available; occupied bays never suppress an unlock announcement or replace equipped drones. Available unassigned drones point to Drone Ops. No story acknowledgement is automatic.</w:t>
       </w:r>
     </w:p>
     <w:p>

</xml_diff>

<commit_message>
Polish mission UI, contextual interactions, and fuel cell art
</commit_message>
<xml_diff>
--- a/docs/Rocket_Rogue_Game_Design_Document.docx
+++ b/docs/Rocket_Rogue_Game_Design_Document.docx
@@ -4155,7 +4155,7 @@
     <w:p>
       <w:pPr/>
       <w:r>
-        <w:t>C or controller left-stick click toggles cruise. Cruise uses ordinary steering and forward thrust toward the selected body center, with no braking, avoidance, capture assistance, fuel advantage, or destination protection. Manual steering or thrust cancels it immediately. Map inspection pauses simulation and visibly identifies cruise that will resume on closing. Earth docking requires rendezvous with its orbital marker within 2 system units at no more than 1.0 relative speed and an explicit Dock action; choosing Earth on the map does not dock or service the ship. Plot course immediately exposes target guidance and a brief manual-flight or active-cruise notice. At home, Depart dock enters a ready view; the dock holds the ship until forward or lateral thrust releases it and applies ordinary thrust in the same step. No velocity grant or protection persists after undocking. The Earth service dock is 1.962 units toward the Moon from Earth center, outside every local gravity region including its full docking range. Dock offsets belong to system content. Explicitly attached Earth dock saves follow the current marker, preserving resources and heading; free-flight and surface positions remain unchanged.</w:t>
+        <w:t>C or controller left-stick click toggles cruise. F or controller North salvages the one eligible nearby wreck; a short world-anchored prompt appears only in range and offers Match speed when necessary. Cruise state stays with flight telemetry instead of a bottom action bar. Cruise uses ordinary steering and forward thrust toward the selected body center, with no braking, avoidance, capture assistance, fuel advantage, or destination protection. Manual steering or thrust cancels it immediately. Map inspection pauses simulation and visibly identifies cruise that will resume on closing. Earth docking requires rendezvous with its orbital marker within 2 system units at no more than 1.0 relative speed and an explicit Dock action; choosing Earth on the map does not dock or service the ship. Plot course immediately exposes target guidance and a brief manual-flight or active-cruise notice. At home, Depart dock enters a ready view; the dock holds the ship until forward or lateral thrust releases it and applies ordinary thrust in the same step. No velocity grant or protection persists after undocking. The Earth service dock is 1.962 units toward the Moon from Earth center, outside every local gravity region including its full docking range. Dock offsets belong to system content. Explicitly attached Earth dock saves follow the current marker, preserving resources and heading; free-flight and surface positions remain unchanged.</w:t>
       </w:r>
     </w:p>
     <w:p>
@@ -4169,7 +4169,7 @@
     <w:p>
       <w:pPr/>
       <w:r>
-        <w:t>One persistent tracker below the upper-left HUD names the tracked mission and location. Solar missions show separate read-only checkboxes for orbit, Common Ore delivered to the ship, and the artifact brought aboard. Active surface and saved survey progress mark orbit complete. Ore and artifact goals remain independent; the artifact row explains the ore-first gate. Short contextual instructions appear when needed, and ready rewards add a claim goal. It remains visible during travel, orbit, landing, mining and docking, but yields to full-screen messages and cinematics. Actual step changes briefly highlight the tracker; repeated reminders and automatic mission rotation are avoided. Survival warnings retain priority.</w:t>
+        <w:t>One persistent tracker below the upper-left HUD names the tracked mission and location. Required Io commissioning and other live mission actions stay in the tracker or log when the flight action bar is absent. Solar missions show separate read-only checkboxes for orbit, Common Ore delivered to the ship, and the artifact brought aboard. Active surface and saved survey progress mark orbit complete. Ore and artifact goals remain independent; the artifact row explains the ore-first gate. Short contextual instructions appear when needed, and ready rewards add a claim goal. It remains visible during travel, orbit, landing, mining and docking, but yields to full-screen messages and cinematics. Actual step changes briefly highlight the tracker; repeated reminders and automatic mission rotation are avoided. Survival warnings retain priority.</w:t>
       </w:r>
     </w:p>
     <w:p>
@@ -6158,7 +6158,7 @@
     </w:p>
     <w:p>
       <w:r>
-        <w:t>Ship services and return guidance use the parked ship position and layer, including underground landings. Removing the terrain beneath the parked ship lets it fall under landing gravity. Its upright hull sweeps the full landing width and settles on the next supporting surface, including across cached depth layers. Ship services, return guidance and departure follow its physical location; the original surface reference remains fixed. Saves retain its position and falling velocity. Within its service field, a docked Rig refills Rig oxygen, an EVA operator refills Suit oxygen, and an occupied docked Rig refills both. Oxygen service never creates fuel. Departure requires the controlled actor in the ship service zone: the Rig in Rig mode or the operator in EVA. The operator may leave without a functioning Rig; cargo and drones left behind are not teleported or credited. Terrain and unopened seam lips remain physical barriers to return travel.</w:t>
+        <w:t>Ship services and return guidance use the parked ship position and layer, including underground landings. A compact clickable Ship Services list appears beside the ship only while the player is in its service zone. It shows relevant banking, scanning, repairs with costs, Drone Ops, waiting for drones, and departure; departure warns of drones or cargo left behind. Controller D-pad Up opens Drone Ops, Right waits, and held Down departs; Left retains panel focus. A fresh press is required after entering the zone, switching devices, or leaving a menu. Removing the terrain beneath the parked ship lets it fall under landing gravity. Its upright hull sweeps the full landing width and settles on the next supporting surface, including across cached depth layers. Ship services, return guidance and departure follow its physical location; the original surface reference remains fixed. Saves retain its position and falling velocity. Within its service field, a docked Rig refills Rig oxygen, an EVA operator refills Suit oxygen, and an occupied docked Rig refills both. Oxygen service never creates fuel. Departure requires the controlled actor in the ship service zone: the Rig in Rig mode or the operator in EVA. The operator may leave without a functioning Rig; cargo and drones left behind are not teleported or credited. Terrain and unopened seam lips remain physical barriers to return travel.</w:t>
       </w:r>
     </w:p>
     <w:p>
@@ -9481,7 +9481,7 @@
     <w:p>
       <w:pPr/>
       <w:r>
-        <w:t>The first ship loss opens a saved, explicitly acknowledged salvage explanation at the home dock. If it carries an artifact, one combined recovery briefing explains the named wreck, 2U salvage range, speed matching and return to the required delivery dock. It replaces the overlapping generic salvage notice. Artifact-bearing wrecks use a purple diamond and an Artifact / Wreck label; after artifact recovery, remaining ore uses an ordinary wreck marker. Full ore holds do not prevent artifact or upgrade recovery. Stored artifacts remain safe.</w:t>
+        <w:t>The first ship loss gives one concise salvage explanation at the home dock. If an artifact was aboard, its named wreck becomes the mission target; the first artifact-bearing wreck uses the artifact-specific explanation instead of a second salvage card. Match speed within 2U to recover it, even with a full ore hold. Later losses update the tracker without replaying the lesson. Stored artifacts remain safe.</w:t>
       </w:r>
     </w:p>
     <w:p>
@@ -11620,7 +11620,7 @@
         <w:pStyle w:val="ListBullet"/>
       </w:pPr>
       <w:r>
-        <w:t>Incoming Messages use a transmission card with portrait, speaker, channel, title, concise text and explicit acknowledgement. Mission logic owns eligibility; the card does not grant rewards or mutate cargo. Fennec retains essential first-time instructions, character dialogue, mission acceptance and story decisions. Independent informational messages are separated by eight seconds of active gameplay and deferred during drilling, combat, local landing/ascent and docking. Stale cargo/fuel tips retire when their condition clears. Drone unlock information is consolidated into associated briefings where available; occupied bays never suppress an unlock announcement or replace equipped drones. Available unassigned drones point to Drone Ops. No story acknowledgement is automatic.</w:t>
+        <w:t>Incoming Messages use a portrait, title, short body and explicit acknowledgement. Fennec teaches the first launch, orbit, scanner, EVA crevice, orbital bore, and distinct hazards or drone unlocks. Routine Titan, Titania, Triton and optional assignments are accepted in the tracker or Missions log; ore, artifact, depth, sector and delivery state live in its checklist. The authored Fennec copy is roughly half its prior word count. Independent informational cards wait eight seconds of active gameplay and defer during drilling, combat, docking and local flight. The first hard touchdown explains hull damage at the safe landing pause; Moon/Mars combine it with their arrival card. Pending warnings expire after deployment, departure, destruction or a later landing. Acknowledgement never grants rewards or accepts a different mission.</w:t>
       </w:r>
     </w:p>
     <w:p>
@@ -11686,7 +11686,7 @@
     </w:p>
     <w:p>
       <w:r>
-        <w:t>Mining presentation shows the parked Rig, EVA operator, independent Support Drones, reticle, tracer, tether, thrust, and active-actor shield/scanner effects. Undiscovered non-triangulation artifact tiles use a light purple glow; exposed artifacts use a larger brighter purple aura; tether denial flashes that aura red twice. Triangulation uses one large three-slice cyan/green aura and never renders the hidden ping coordinates. Ship departure uses the existing red/orange flame attached to the hull rather than a placeholder triangle. Native RmlUi and web prompts share the same vocabulary and action state.</w:t>
+        <w:t>Mining presentation shows the parked Rig, EVA operator, independent Support Drones, reticle, tracer, tether, thrust, and active-actor shield/scanner effects. One world-anchored clickable action prompt appears beside the eligible artifact, Rig, fuel cell, or wreck; blocked targets show only a short prerequisite cue. The mining bottom rail keeps payload status but no command buttons. The marked mission sector, revealed artifact and relevant wreck markers pulse at a restrained rate; an in-range interactable becomes brighter and steady. Hidden objectives remain hidden. Undiscovered non-triangulation artifact tiles use a light purple glow; exposed artifacts use a larger brighter purple aura; tether denial flashes that aura red twice. Triangulation uses one large three-slice cyan/green aura and never renders the hidden ping coordinates. Ship departure uses the existing red/orange flame attached to the hull rather than a placeholder triangle. Native RmlUi and web prompts share the same vocabulary and action state.</w:t>
       </w:r>
     </w:p>
     <w:p>
@@ -13340,7 +13340,7 @@
         <w:pStyle w:val="ListBullet"/>
       </w:pPr>
       <w:r>
-        <w:t>TBD S1 Further teaching and pacing. The implemented opening uses a one-second fade, Launch-triggered instruction, cause-aware crash retries and contextual messages for dock approach, hard landings, full cargo, lunar discovery and the first Prospector. The first scan names the mission sector and explains ore-before-artifact recovery; the persistent tracker and Missions log share authoritative progress. Further first-time-player observation should refine clarity without adding redundant text.</w:t>
+        <w:t>TBD S1 Further teaching and pacing. The opening retains concise launch and orbit instruction, cause-aware crash recovery, a short Moon/Mars touchdown gate, and contextual scanner, crevice and shaft lessons. First scan names the mission sector and ore-before-artifact order. Later routine assignments use the mission checklist and explicit Accept mission action without automatic Fennec briefing cards. Observe first-time players for clarity before adding text.</w:t>
       </w:r>
     </w:p>
     <w:p>

</xml_diff>

<commit_message>
Polish demo feedback flows and UI
</commit_message>
<xml_diff>
--- a/docs/Rocket_Rogue_Game_Design_Document.docx
+++ b/docs/Rocket_Rogue_Game_Design_Document.docx
@@ -2476,7 +2476,7 @@
                 <w:color w:val="000000"/>
                 <w:sz w:val="20"/>
               </w:rPr>
-              <w:t>Lunar exploration, industrial delivery, first Prospector and EVA anomaly recovery.</w:t>
+              <w:t>Lunar exploration, industrial delivery, first Mining Drone and EVA anomaly recovery.</w:t>
             </w:r>
           </w:p>
         </w:tc>
@@ -2493,7 +2493,7 @@
           </w:tcPr>
           <w:p>
             <w:r>
-              <w:t>Moon contract, artifact, battery, Prospector, and Mars discovery are canonical.</w:t>
+              <w:t>Moon contract, artifact, battery, Mining Drone, and Mars discovery are canonical.</w:t>
             </w:r>
           </w:p>
         </w:tc>
@@ -3619,7 +3619,7 @@
           </w:tcPr>
           <w:p>
             <w:r>
-              <w:t>Lunar Prospector</w:t>
+              <w:t>Moon recovery</w:t>
             </w:r>
           </w:p>
         </w:tc>
@@ -3636,7 +3636,7 @@
           </w:tcPr>
           <w:p>
             <w:r>
-              <w:t>Deliver 20 Common Ore; pulse and recover the Moon artifact; claim Prospector, Slot 1, Moon battery, Mars, Mercury, and Venus.</w:t>
+              <w:t>Deliver 20 Common Ore; pulse and recover the Moon artifact; claim Mining Drone, Slot 1, Moon battery, Mars, Mercury, and Venus.</w:t>
             </w:r>
           </w:p>
         </w:tc>
@@ -9808,7 +9808,7 @@
           </w:tcPr>
           <w:p>
             <w:r>
-              <w:t>First mining contract, persistent artifact, Moon battery, Prospector, and optional inner-world discoveries.</w:t>
+              <w:t>First mining contract, persistent artifact, Moon battery, Mining Drone, and optional inner-world discoveries.</w:t>
             </w:r>
           </w:p>
         </w:tc>
@@ -12350,7 +12350,7 @@
     </w:p>
     <w:p>
       <w:r>
-        <w:t>Scenario definitions provide eligibility, dependent steps, completion rules, explicit claims, rewards, messages, discoveries, and the next recommended mission. Typed events identify the physical body, so shared geology cannot complete another world's objective. The Moon 20-ore delivery activates its anomaly; claiming the recovered artifact grants Prospector MK I, Slot 1, and the Mars route. Mars requires 8 Common Ore and its artifact. Io requires Hazard support and its protected recovery. Titan, Titania, and Triton continue the artifact chain. Claims grant rewards in place without relocating the ship, forcing departure, or opening another gameplay screen.</w:t>
+        <w:t>Scenario definitions provide eligibility, dependent steps, completion rules, explicit claims, rewards, messages, discoveries, and the next recommended mission. Typed events identify the physical body, so shared geology cannot complete another world's objective. The Moon 20-ore delivery activates its anomaly; claiming the recovered artifact grants the Mining Drone, Slot 1, and the Mars route. The cyan claim card names only the Mining Drone. Mars requires 8 Common Ore and its artifact. Io requires Hazard support and its protected recovery. Titan, Titania, and Triton continue the artifact chain. Claims grant rewards in place without relocating the ship, forcing departure, or opening another gameplay screen.</w:t>
       </w:r>
     </w:p>
     <w:p>

</xml_diff>

<commit_message>
Polish mining recovery and demo feedback flows
</commit_message>
<xml_diff>
--- a/docs/Rocket_Rogue_Game_Design_Document.docx
+++ b/docs/Rocket_Rogue_Game_Design_Document.docx
@@ -5496,12 +5496,12 @@
     </w:p>
     <w:p>
       <w:r>
-        <w:t>Deployment begins in the Mining Rig beside the ship at its actual touchdown layer. The Rig has an independent home-supplied tank, initially 13 units, which carries between planetary visits and refills at home. Existing physical saves retain their recorded Rig tank. Powered thrust and drilling consume independently and stack; coasting and idling are free. Rig Fuel Loop ranks reduce powered consumption by 10/20/30 percent. Load increases thrust cost. A physical fuel cell transfers up to one unit on Rig contact, limited by capacity. Rig fuel cells never become ship propellant. A zero-fuel Rig remains recoverable through EVA, fuel delivery, towing, or cargo rescue.</w:t>
+        <w:t>Deployment begins in the Mining Rig beside the ship at its actual touchdown layer. The Rig has an independent home-supplied tank, initially 13 units, which carries between planetary visits and refills at home. Existing physical saves retain their recorded Rig tank. Powered thrust and drilling consume independently and stack; coasting and idling are free. Rig Fuel Loop ranks reduce powered consumption by 10/20/30 percent. Load increases thrust cost. A physical fuel cell transfers up to one unit on Rig contact, limited by capacity. Rig fuel cells never become ship propellant. Cells carried during departure refill the Rig; any excess is packed aboard and automatically feeds the Rig tank during later mining without a menu action. Home service replenishes this fuel supply. A zero-fuel Rig remains recoverable through EVA, fuel delivery, towing, or cargo rescue.</w:t>
       </w:r>
     </w:p>
     <w:p>
       <w:r>
-        <w:t>The mining Rig turns toward the mouse without holding Shift. WASD or arrows move in screen directions regardless of drill heading: W/Up moves up, S/Down moves down, and A/D or Left/Right move sideways. Shift does not change mining controls. On controller, the left stick moves in screen directions regardless of drill heading. The right stick points the drill in any screen direction, including diagonals; centering it holds the current heading. Turning follows the shortest angular path, with exactly opposite targets turning clockwise. Stick deflection does not scale turning speed; the existing controller deadzone applies. Mouse aiming uses the rendered Rig center and a small dead zone. UI hover and gameplay interruptions suspend mouse aiming. Rotation retains damped hull motion and terrain collision checks. EVA keeps WASD/arrows or left-stick movement. Space uses the Rig drill preference; mouse/controller drill inputs are held. In EVA, mouse or right stick aims independently, left click or RT fires, right click or LT drills, E or controller West scans, T or North toggles tether, and F exits or enters immediately. Holding controller South for 0.6 seconds switches actors; a shorter release performs the contextual ship action. R performs that ship action on keyboard. Pause, modals, focus loss, disconnect, and source switching clear held gameplay inputs.</w:t>
+        <w:t>The mining Rig turns toward the mouse without holding Shift. WASD or arrows move in screen directions regardless of drill heading: W/Up moves up, S/Down moves down, and A/D or Left/Right move sideways. Shift does not change mining controls. On controller, the left stick moves in screen directions regardless of drill heading. The right stick points the drill in any screen direction, including diagonals; centering it holds the current heading. Turning follows the shortest angular path, with exactly opposite targets turning clockwise. Stick deflection does not scale turning speed; the existing controller deadzone applies. Mouse aiming uses the rendered Rig center and a small dead zone. UI hover and gameplay interruptions suspend mouse aiming. Rotation retains damped hull motion and terrain collision checks. EVA keeps WASD/arrows or left-stick movement. Space uses the Rig drill preference; mouse/controller drill inputs are held. In EVA, mouse or right stick aims independently, left click or RT fires, right click or LT drills, E or controller West scans, T or North toggles tether, and F exits or enters immediately. Holding controller South for 0.6 seconds switches actors; a shorter release performs the contextual ship action. At the ship, O opens Drone Ops, Q repairs the drill, R repairs the Rig or suit, and G departs. Pause, modals, focus loss, disconnect, and source switching clear held gameplay inputs.</w:t>
       </w:r>
     </w:p>
     <w:tbl>
@@ -6158,7 +6158,7 @@
     </w:p>
     <w:p>
       <w:r>
-        <w:t>Ship services and return guidance use the parked ship position and layer, including underground landings. A compact clickable Ship Services list appears beside the ship only while the player is in its service zone. It shows relevant banking, scanning, repairs with costs, Drone Ops, waiting for drones, and departure; departure warns of drones or cargo left behind. Controller D-pad Up opens Drone Ops, Right waits, and held Down departs; Left retains panel focus. A fresh press is required after entering the zone, switching devices, or leaving a menu. Removing the terrain beneath the parked ship lets it fall under landing gravity. Its upright hull sweeps the full landing width and settles on the next supporting surface, including across cached depth layers. Ship services, return guidance and departure follow its physical location; the original surface reference remains fixed. Saves retain its position and falling velocity. Within its service field, a docked Rig refills Rig oxygen, an EVA operator refills Suit oxygen, and an occupied docked Rig refills both. Oxygen service never creates fuel. Departure requires the controlled actor in the ship service zone: the Rig in Rig mode or the operator in EVA. The operator may leave without a functioning Rig; cargo and drones left behind are not teleported or credited. Terrain and unopened seam lips remain physical barriers to return travel.</w:t>
+        <w:t>Ship services and return guidance use the parked ship position and layer, including underground landings. A compact clickable Ship Services list appears beside the ship only while the player is in its service zone. It shows relevant scanning, repairs with costs, Drone Ops, and one Depart action. At Ship Services, O / D-pad Up opens Drone Ops, E / West scans, Q / LB repairs the drill, R / RB repairs the Rig or suit, and G / held D-pad Down departs; D-pad Left retains panel focus. A fresh press is required after entering the zone, switching devices, or leaving a menu. Removing the terrain beneath the parked ship lets it fall under landing gravity. Its upright hull sweeps the full landing width and settles on the next supporting surface, including across cached depth layers. Ship services, return guidance and departure follow its physical location; the original surface reference remains fixed. Saves retain its position and falling velocity. Within its service field, a docked Rig refills Rig oxygen, an EVA operator refills Suit oxygen, and an occupied docked Rig refills both. Oxygen service never creates fuel. Departure requires the controlled actor in the ship service zone: the Rig in Rig mode or the operator in EVA. Depart immediately recovers the Rig, every equipped Support Drone, and all their carried ore, fuel cells and collected or loose tethered artifacts from any depth, including a disabled Rig. The existing packing animation draws them into the bay. There is no waiting action, abandonment choice or variable warning on the Depart button. Uncollected resources and embedded or untethered artifacts remain at the site. Terrain and unopened seam lips remain physical barriers to return travel.</w:t>
       </w:r>
     </w:p>
     <w:p>
@@ -7997,7 +7997,7 @@
     </w:p>
     <w:p>
       <w:r>
-        <w:t>Physical delivery allocates contract ore first; ordinary salvage enters the expedition hold and remains at risk until home docking. The initial ship hold carries 60 ore. The Mining Rig starts at 24 cargo capacity; Cargo Skids, Ore Hopper, and Expandable Panniers add 2, 1, and 3 capacity per rank. Load bands remain proportional to capacity. Excess stays with its physical carrier or in the site and is never silently banked. Loose ore within the effective drill footprint is collectible; Ore Magnet adds reach beyond the tool. Earth banks carried cargo and payout, services fuel and hull, and preserves the expedition build. Revisits do not duplicate payouts.</w:t>
+        <w:t>Physical delivery allocates contract ore first; ordinary salvage enters the expedition hold and remains at risk until home docking. The initial ship hold carries 60 ore. The Mining Rig starts at 24 cargo capacity; Cargo Skids, Ore Hopper, and Expandable Panniers add 2, 1, and 3 capacity per rank. Load bands remain proportional to capacity. During mining, excess stays with its carrier or at the site. Depart secures all carried ore even beyond normal hold capacity, allocates contract ore first, and credits only previously unearned drone XP. Consumed manifests and carried physical objects are cleared exactly once; saving or revisiting cannot duplicate them. Emergency Recall after failure retains its separate loss rules. Loose ore within the effective drill footprint is collectible; Ore Magnet adds reach beyond the tool. Earth banks carried cargo and payout, services fuel and hull, and preserves the expedition build. Revisits do not duplicate payouts.</w:t>
       </w:r>
     </w:p>
     <w:tbl>
@@ -9446,6 +9446,24 @@
       </w:tr>
     </w:tbl>
     <w:p>
+      <w:pPr>
+        <w:pStyle w:val="Heading3"/>
+      </w:pPr>
+      <w:r>
+        <w:t>Drone Ops</w:t>
+      </w:r>
+    </w:p>
+    <w:p>
+      <w:r>
+        <w:t>Drone Ops is a focused equipment screen: choose a loadout slot, select a drone, then Equip or Replace. The loadout strip shows only unlocked slots. Available and Locked views separate usable types from future unlocks; selecting or focusing a drone updates one preview with its purpose, expedition Mk, up to three capabilities, relevant grafts and selected synergy effects. Browsing never equips or spends materials. Locked previews name their unlock requirement and preserve explicit commissioning actions. Matching roles never grants a synergy that has not been selected at Level Up.</w:t>
+      </w:r>
+    </w:p>
+    <w:p>
+      <w:r>
+        <w:t>Replacement keeps the outgoing frame owned, preserves neighboring workers and their cargo, and discloses any removed graft before committing. Paid fabrication shows the material cost, owned balances and shortfall beside an explicit Build action. Changes save immediately. One expansion affordance shows the next mission requirement or a paid empty slot. Missions opens from the reserved header; the floating mission tracker is suppressed here. Only loadout capability requirements remain inline. Native and browser rendering share the same layout and controller navigation; repeated Details buttons, material dashboards, future-slot cards and unrelated mission banners are omitted.</w:t>
+      </w:r>
+    </w:p>
+    <w:p>
       <w:r>
         <w:t>Mini drones remain independently simulated world entities. A same-layer anchor transfer never teleports them: position, velocity, haul, shield charge, recharge, cooldowns, stable formation slot, and orbit phase persist while cell assignments and layer-local targets clear. Non-combat roles enter Returning; Attack and Defense roles reacquire around the new actor on the next update. Following and defending outrank finishing a remote task, and no drone returns to a parked or destroyed rig.</w:t>
       </w:r>
@@ -9457,7 +9475,7 @@
     </w:p>
     <w:p>
       <w:r>
-        <w:t>The active-actor frame controls drone task search, target scoring, field of view, shield arcs, scanner origins, collision clearance, and support effects. Attack drones choose threats near that actor; Defense drones intercept damage there. Hauling drones use terrain-aware delivery routes to the actual parked ship across cached layers. Their manifests become ship cargo only on physical delivery, never when a transit timer expires.</w:t>
+        <w:t>The active-actor frame controls drone task search, target scoring, field of view, shield arcs, scanner origins, collision clearance, and support effects. Attack drones choose threats near that actor; Defense drones intercept damage there. Hauling drones use terrain-aware delivery routes to the actual parked ship across cached layers. During mining, their manifests become ship cargo on physical delivery. Depart instead recovers every carrier and manifest immediately; no return path or transit timer delays departure.</w:t>
       </w:r>
     </w:p>
     <w:p>
@@ -11613,6 +11631,14 @@
       </w:pPr>
       <w:r>
         <w:t>Prioritize large primary action buttons and concise status. Remove repeated objectives, controls and explanations from captured-orbit inspection; SCAN, DRILL, LAND and RESUME FLIGHT remain prominent. Show additional help when context makes it useful.</w:t>
+      </w:r>
+    </w:p>
+    <w:p>
+      <w:pPr>
+        <w:pStyle w:val="ListBullet"/>
+      </w:pPr>
+      <w:r>
+        <w:t>The Pause menu is a compact action panel: Resume leads, with Controls, Settings, Map, and Inventory grouped beneath it where available. Settings shows one of three tabs at a time: Display for resolution, fullscreen, and frame rate; Controls for input preferences; Gameplay for introductions and camera shake. A separate Developer options page holds game speed, debug screens, performance diagnostics, and technical save/build status. Reset Save stays in the Settings footer behind its hold confirmation. Mouse, keyboard, and controller navigation share the same focus and Back behavior; safety pauses require explicit Resume.</w:t>
       </w:r>
     </w:p>
     <w:p>

</xml_diff>